<commit_message>
Add organization export template variants
</commit_message>
<xml_diff>
--- a/samples/templates/organization/bbtl_cong_ty.docx
+++ b/samples/templates/organization/bbtl_cong_ty.docx
@@ -1,19 +1,15 @@
 
 <file path=word/document.xml><?xml version="1.0" encoding="utf-8"?>
-<w:document xmlns:o="urn:schemas-microsoft-com:office:office" xmlns:r="http://schemas.openxmlformats.org/officeDocument/2006/relationships" xmlns:v="urn:schemas-microsoft-com:vml" xmlns:w="http://schemas.openxmlformats.org/wordprocessingml/2006/main" xmlns:w10="urn:schemas-microsoft-com:office:word" xmlns:wp="http://schemas.openxmlformats.org/drawingml/2006/wordprocessingDrawing" xmlns:pic="http://schemas.openxmlformats.org/drawingml/2006/picture" xmlns:wps="http://schemas.microsoft.com/office/word/2010/wordprocessingShape" xmlns:wpg="http://schemas.microsoft.com/office/word/2010/wordprocessingGroup" xmlns:mc="http://schemas.openxmlformats.org/markup-compatibility/2006" xmlns:wp14="http://schemas.microsoft.com/office/word/2010/wordprocessingDrawing" xmlns:w14="http://schemas.microsoft.com/office/word/2010/wordml" xmlns:w15="http://schemas.microsoft.com/office/word/2012/wordml" mc:Ignorable="w14 wp14 w15">
+<w:document xmlns:wpc="http://schemas.microsoft.com/office/word/2010/wordprocessingCanvas" xmlns:cx="http://schemas.microsoft.com/office/drawing/2014/chartex" xmlns:cx1="http://schemas.microsoft.com/office/drawing/2015/9/8/chartex" xmlns:cx2="http://schemas.microsoft.com/office/drawing/2015/10/21/chartex" xmlns:cx3="http://schemas.microsoft.com/office/drawing/2016/5/9/chartex" xmlns:cx4="http://schemas.microsoft.com/office/drawing/2016/5/10/chartex" xmlns:cx5="http://schemas.microsoft.com/office/drawing/2016/5/11/chartex" xmlns:cx6="http://schemas.microsoft.com/office/drawing/2016/5/12/chartex" xmlns:cx7="http://schemas.microsoft.com/office/drawing/2016/5/13/chartex" xmlns:cx8="http://schemas.microsoft.com/office/drawing/2016/5/14/chartex" xmlns:mc="http://schemas.openxmlformats.org/markup-compatibility/2006" xmlns:aink="http://schemas.microsoft.com/office/drawing/2016/ink" xmlns:am3d="http://schemas.microsoft.com/office/drawing/2017/model3d" xmlns:o="urn:schemas-microsoft-com:office:office" xmlns:oel="http://schemas.microsoft.com/office/2019/extlst" xmlns:r="http://schemas.openxmlformats.org/officeDocument/2006/relationships" xmlns:m="http://schemas.openxmlformats.org/officeDocument/2006/math" xmlns:v="urn:schemas-microsoft-com:vml" xmlns:wp14="http://schemas.microsoft.com/office/word/2010/wordprocessingDrawing" xmlns:wp="http://schemas.openxmlformats.org/drawingml/2006/wordprocessingDrawing" xmlns:w10="urn:schemas-microsoft-com:office:word" xmlns:w="http://schemas.openxmlformats.org/wordprocessingml/2006/main" xmlns:w14="http://schemas.microsoft.com/office/word/2010/wordml" xmlns:w15="http://schemas.microsoft.com/office/word/2012/wordml" xmlns:w16cex="http://schemas.microsoft.com/office/word/2018/wordml/cex" xmlns:w16cid="http://schemas.microsoft.com/office/word/2016/wordml/cid" xmlns:w16="http://schemas.microsoft.com/office/word/2018/wordml" xmlns:w16du="http://schemas.microsoft.com/office/word/2023/wordml/word16du" xmlns:w16sdtdh="http://schemas.microsoft.com/office/word/2020/wordml/sdtdatahash" xmlns:w16sdtfl="http://schemas.microsoft.com/office/word/2024/wordml/sdtformatlock" xmlns:w16se="http://schemas.microsoft.com/office/word/2015/wordml/symex" xmlns:wpg="http://schemas.microsoft.com/office/word/2010/wordprocessingGroup" xmlns:wpi="http://schemas.microsoft.com/office/word/2010/wordprocessingInk" xmlns:wne="http://schemas.microsoft.com/office/word/2006/wordml" xmlns:wps="http://schemas.microsoft.com/office/word/2010/wordprocessingShape" mc:Ignorable="w14 w15 w16se w16cid w16 w16cex w16sdtdh w16sdtfl w16du wp14">
   <w:body>
     <w:p>
       <w:pPr>
-        <w:pStyle w:val="Normal"/>
-        <w:tabs>
-          <w:tab w:val="clear" w:pos="720"/>
-          <w:tab w:val="center" w:pos="2268" w:leader="none"/>
-          <w:tab w:val="center" w:pos="7380" w:leader="none"/>
-        </w:tabs>
-        <w:rPr/>
-      </w:pPr>
-      <w:r>
-        <w:rPr/>
+        <w:tabs>
+          <w:tab w:val="center" w:pos="2268"/>
+          <w:tab w:val="center" w:pos="7380"/>
+        </w:tabs>
+      </w:pPr>
+      <w:r>
         <w:tab/>
       </w:r>
       <w:r>
@@ -23,20 +19,7 @@
           <w:szCs w:val="22"/>
         </w:rPr>
         <w:t>CÔNG TY CỔ PHẦN THẨM ĐỊNH GIÁ THẾ KỶ</w:t>
-        <w:tab/>
-        <w:t>CỘNG HÒA XÃ HỘI CHỦ NGHĨA VIỆT NAM</w:t>
-      </w:r>
-    </w:p>
-    <w:p>
-      <w:pPr>
-        <w:pStyle w:val="Normal"/>
-        <w:tabs>
-          <w:tab w:val="clear" w:pos="720"/>
-          <w:tab w:val="center" w:pos="2268" w:leader="none"/>
-          <w:tab w:val="center" w:pos="7020" w:leader="none"/>
-        </w:tabs>
-        <w:rPr/>
-      </w:pPr>
+      </w:r>
       <w:r>
         <w:rPr>
           <w:b/>
@@ -44,93 +27,86 @@
           <w:szCs w:val="22"/>
         </w:rPr>
         <w:tab/>
-        <w:t>Số:  {{SO_BIEN_BAN_NGHIEM_THU}}</w:t>
-        <w:tab/>
-        <w:t>Độc lập - Tự do - Hạnh phúc</w:t>
-      </w:r>
-      <w:r>
-        <w:rPr>
-          <w:sz w:val="22"/>
-          <w:szCs w:val="22"/>
-        </w:rPr>
-      </w:r>
-      <w:r>
-        <w:rPr>
-          <w:color w:val="000000"/>
-          <w:sz w:val="22"/>
-          <w:szCs w:val="22"/>
-        </w:rPr>
-      </w:r>
-      <w:r>
-        <w:rPr>
-          <w:sz w:val="22"/>
-          <w:szCs w:val="22"/>
-        </w:rPr>
-      </w:r>
-    </w:p>
-    <w:p>
-      <w:pPr>
-        <w:pStyle w:val="Normal"/>
-        <w:tabs>
-          <w:tab w:val="clear" w:pos="720"/>
-          <w:tab w:val="center" w:pos="1843" w:leader="none"/>
-          <w:tab w:val="center" w:pos="7020" w:leader="none"/>
-        </w:tabs>
-        <w:rPr>
-          <w:sz w:val="22"/>
-          <w:szCs w:val="22"/>
-        </w:rPr>
-      </w:pPr>
-      <w:r>
-        <w:rPr>
-          <w:sz w:val="22"/>
-          <w:szCs w:val="22"/>
-        </w:rPr>
-        <w:tab/>
-        <w:tab/>
-        <w:t>----------o0o----------</w:t>
-      </w:r>
-    </w:p>
-    <w:p>
-      <w:pPr>
-        <w:pStyle w:val="Normal"/>
-        <w:tabs>
-          <w:tab w:val="clear" w:pos="720"/>
-          <w:tab w:val="center" w:pos="2268" w:leader="none"/>
-          <w:tab w:val="center" w:pos="7380" w:leader="none"/>
-        </w:tabs>
-        <w:ind w:start="900" w:end="0"/>
+        <w:t>CỘNG HÒA XÃ HỘI CHỦ NGHĨA VIỆT NAM</w:t>
+      </w:r>
+    </w:p>
+    <w:p>
+      <w:pPr>
+        <w:tabs>
+          <w:tab w:val="center" w:pos="2268"/>
+          <w:tab w:val="center" w:pos="7020"/>
+        </w:tabs>
+      </w:pPr>
+      <w:r>
         <w:rPr>
           <w:b/>
           <w:sz w:val="22"/>
           <w:szCs w:val="22"/>
         </w:rPr>
-      </w:pPr>
+        <w:tab/>
+        <w:t>Số:  {{SO_BIEN_BAN_NGHIEM_THU}}</w:t>
+      </w:r>
       <w:r>
         <w:rPr>
           <w:b/>
           <w:sz w:val="22"/>
           <w:szCs w:val="22"/>
         </w:rPr>
-      </w:r>
-    </w:p>
-    <w:p>
-      <w:pPr>
-        <w:pStyle w:val="Normal"/>
+        <w:tab/>
+        <w:t>Độc lập - Tự do - Hạnh phúc</w:t>
+      </w:r>
+    </w:p>
+    <w:p>
+      <w:pPr>
+        <w:tabs>
+          <w:tab w:val="center" w:pos="1843"/>
+          <w:tab w:val="center" w:pos="7020"/>
+        </w:tabs>
+        <w:rPr>
+          <w:sz w:val="22"/>
+          <w:szCs w:val="22"/>
+        </w:rPr>
+      </w:pPr>
+      <w:r>
+        <w:rPr>
+          <w:sz w:val="22"/>
+          <w:szCs w:val="22"/>
+        </w:rPr>
+        <w:tab/>
+      </w:r>
+      <w:r>
+        <w:rPr>
+          <w:sz w:val="22"/>
+          <w:szCs w:val="22"/>
+        </w:rPr>
+        <w:tab/>
+        <w:t>----------o0o----------</w:t>
+      </w:r>
+    </w:p>
+    <w:p>
+      <w:pPr>
+        <w:tabs>
+          <w:tab w:val="center" w:pos="2268"/>
+          <w:tab w:val="center" w:pos="7380"/>
+        </w:tabs>
+        <w:ind w:left="900"/>
+        <w:rPr>
+          <w:b/>
+          <w:sz w:val="22"/>
+          <w:szCs w:val="22"/>
+        </w:rPr>
+      </w:pPr>
+    </w:p>
+    <w:p>
+      <w:pPr>
         <w:jc w:val="center"/>
         <w:rPr>
           <w:b/>
         </w:rPr>
       </w:pPr>
-      <w:r>
-        <w:rPr>
-          <w:b/>
-        </w:rPr>
-      </w:r>
-    </w:p>
-    <w:p>
-      <w:pPr>
-        <w:pStyle w:val="Normal"/>
+    </w:p>
+    <w:p>
+      <w:pPr>
         <w:jc w:val="center"/>
         <w:rPr>
           <w:b/>
@@ -144,49 +120,31 @@
           <w:sz w:val="28"/>
           <w:szCs w:val="28"/>
         </w:rPr>
-        <w:t xml:space="preserve">             </w:t>
-      </w:r>
-      <w:r>
-        <w:rPr>
-          <w:b/>
-          <w:sz w:val="28"/>
-          <w:szCs w:val="28"/>
-        </w:rPr>
-        <w:t>BIÊN BẢN NGHIỆM THU HOÀN THÀNH DỊCH VỤ</w:t>
-      </w:r>
-    </w:p>
-    <w:p>
-      <w:pPr>
-        <w:pStyle w:val="Normal"/>
-        <w:spacing w:lineRule="auto" w:line="360"/>
+        <w:t xml:space="preserve">             BIÊN BẢN NGHIỆM THU HOÀN THÀNH DỊCH VỤ</w:t>
+      </w:r>
+    </w:p>
+    <w:p>
+      <w:pPr>
+        <w:spacing w:line="360" w:lineRule="auto"/>
         <w:rPr>
           <w:b/>
           <w:sz w:val="22"/>
           <w:szCs w:val="22"/>
         </w:rPr>
       </w:pPr>
-      <w:r>
-        <w:rPr>
-          <w:b/>
-          <w:sz w:val="22"/>
-          <w:szCs w:val="22"/>
-        </w:rPr>
-      </w:r>
-    </w:p>
-    <w:p>
-      <w:pPr>
-        <w:pStyle w:val="Normal"/>
+    </w:p>
+    <w:p>
+      <w:pPr>
         <w:numPr>
           <w:ilvl w:val="0"/>
           <w:numId w:val="2"/>
         </w:numPr>
         <w:tabs>
-          <w:tab w:val="clear" w:pos="720"/>
-          <w:tab w:val="left" w:pos="270" w:leader="none"/>
-          <w:tab w:val="left" w:pos="993" w:leader="none"/>
-        </w:tabs>
-        <w:spacing w:lineRule="auto" w:line="360"/>
-        <w:ind w:hanging="0" w:start="709" w:end="0"/>
+          <w:tab w:val="left" w:pos="270"/>
+          <w:tab w:val="left" w:pos="993"/>
+        </w:tabs>
+        <w:spacing w:line="360" w:lineRule="auto"/>
+        <w:ind w:left="709" w:firstLine="0"/>
         <w:jc w:val="both"/>
         <w:rPr>
           <w:i/>
@@ -222,18 +180,16 @@
     </w:p>
     <w:p>
       <w:pPr>
-        <w:pStyle w:val="Normal"/>
         <w:numPr>
           <w:ilvl w:val="0"/>
           <w:numId w:val="2"/>
         </w:numPr>
         <w:tabs>
-          <w:tab w:val="clear" w:pos="720"/>
-          <w:tab w:val="left" w:pos="993" w:leader="none"/>
-          <w:tab w:val="left" w:pos="1260" w:leader="none"/>
-        </w:tabs>
-        <w:spacing w:lineRule="auto" w:line="360" w:before="0" w:after="0"/>
-        <w:ind w:hanging="0" w:start="709" w:end="0"/>
+          <w:tab w:val="left" w:pos="993"/>
+          <w:tab w:val="left" w:pos="1260"/>
+        </w:tabs>
+        <w:spacing w:line="360" w:lineRule="auto"/>
+        <w:ind w:left="709" w:firstLine="0"/>
         <w:jc w:val="both"/>
         <w:rPr>
           <w:i/>
@@ -269,18 +225,16 @@
     </w:p>
     <w:p>
       <w:pPr>
-        <w:pStyle w:val="Normal"/>
         <w:numPr>
           <w:ilvl w:val="0"/>
           <w:numId w:val="2"/>
         </w:numPr>
         <w:tabs>
-          <w:tab w:val="clear" w:pos="720"/>
-          <w:tab w:val="left" w:pos="993" w:leader="none"/>
-          <w:tab w:val="left" w:pos="1260" w:leader="none"/>
-        </w:tabs>
-        <w:spacing w:lineRule="auto" w:line="360" w:before="0" w:after="0"/>
-        <w:ind w:hanging="0" w:start="709" w:end="0"/>
+          <w:tab w:val="left" w:pos="993"/>
+          <w:tab w:val="left" w:pos="1260"/>
+        </w:tabs>
+        <w:spacing w:line="360" w:lineRule="auto"/>
+        <w:ind w:left="709" w:firstLine="0"/>
         <w:jc w:val="both"/>
         <w:rPr>
           <w:i/>
@@ -316,18 +270,16 @@
     </w:p>
     <w:p>
       <w:pPr>
-        <w:pStyle w:val="Normal"/>
         <w:numPr>
           <w:ilvl w:val="0"/>
           <w:numId w:val="2"/>
         </w:numPr>
         <w:tabs>
-          <w:tab w:val="clear" w:pos="720"/>
-          <w:tab w:val="left" w:pos="993" w:leader="none"/>
-          <w:tab w:val="left" w:pos="1260" w:leader="none"/>
-        </w:tabs>
-        <w:spacing w:lineRule="auto" w:line="360" w:before="0" w:after="0"/>
-        <w:ind w:hanging="0" w:start="709" w:end="0"/>
+          <w:tab w:val="left" w:pos="993"/>
+          <w:tab w:val="left" w:pos="1260"/>
+        </w:tabs>
+        <w:spacing w:line="360" w:lineRule="auto"/>
+        <w:ind w:left="709" w:firstLine="0"/>
         <w:jc w:val="both"/>
         <w:rPr>
           <w:i/>
@@ -341,38 +293,29 @@
           <w:sz w:val="22"/>
           <w:szCs w:val="22"/>
         </w:rPr>
-        <w:t>Căn cứ Hợp đồng thẩm định giá số {{SO_HOP_DONG_VAN_BAN}} ngày 06/10/2025</w:t>
-      </w:r>
-      <w:r>
-        <w:rPr>
-          <w:b/>
+        <w:t xml:space="preserve">Căn cứ Hợp đồng thẩm định giá số {{SO_HOP_DONG_VAN_BAN}} ngày </w:t>
+      </w:r>
+      <w:r>
+        <w:rPr>
           <w:i/>
           <w:sz w:val="22"/>
           <w:szCs w:val="22"/>
         </w:rPr>
-      </w:r>
-      <w:r>
-        <w:rPr>
-          <w:i/>
-          <w:sz w:val="22"/>
-          <w:szCs w:val="22"/>
-        </w:rPr>
-      </w:r>
-    </w:p>
-    <w:p>
-      <w:pPr>
-        <w:pStyle w:val="Normal"/>
+        <w:t>{{NGAY_HOP_DONG}}</w:t>
+      </w:r>
+    </w:p>
+    <w:p>
+      <w:pPr>
         <w:numPr>
           <w:ilvl w:val="0"/>
           <w:numId w:val="2"/>
         </w:numPr>
         <w:tabs>
-          <w:tab w:val="clear" w:pos="720"/>
-          <w:tab w:val="left" w:pos="993" w:leader="none"/>
-          <w:tab w:val="left" w:pos="1260" w:leader="none"/>
-        </w:tabs>
-        <w:spacing w:lineRule="auto" w:line="360" w:before="0" w:after="280"/>
-        <w:ind w:hanging="0" w:start="709" w:end="0"/>
+          <w:tab w:val="left" w:pos="993"/>
+          <w:tab w:val="left" w:pos="1260"/>
+        </w:tabs>
+        <w:spacing w:after="280" w:line="360" w:lineRule="auto"/>
+        <w:ind w:left="709" w:firstLine="0"/>
         <w:jc w:val="both"/>
         <w:rPr>
           <w:i/>
@@ -391,32 +334,28 @@
     </w:p>
     <w:p>
       <w:pPr>
-        <w:pStyle w:val="Normal"/>
-        <w:spacing w:lineRule="auto" w:line="360" w:before="280" w:after="280"/>
-        <w:ind w:start="709" w:end="0"/>
+        <w:spacing w:before="280" w:after="280" w:line="360" w:lineRule="auto"/>
+        <w:ind w:left="709"/>
         <w:jc w:val="both"/>
         <w:rPr>
           <w:i/>
         </w:rPr>
       </w:pPr>
       <w:r>
-        <w:rPr/>
         <w:t>Hôm nay, ngày {{NGAY}} tháng {{THANG}} năm {{NAM}}, chúng tôi gồm có:</w:t>
       </w:r>
     </w:p>
     <w:p>
       <w:pPr>
-        <w:pStyle w:val="Normal"/>
         <w:numPr>
           <w:ilvl w:val="0"/>
           <w:numId w:val="3"/>
         </w:numPr>
         <w:tabs>
-          <w:tab w:val="clear" w:pos="720"/>
-          <w:tab w:val="left" w:pos="1080" w:leader="none"/>
-        </w:tabs>
-        <w:spacing w:lineRule="auto" w:line="360" w:before="280" w:after="280"/>
-        <w:ind w:hanging="357" w:start="1077" w:end="0"/>
+          <w:tab w:val="left" w:pos="1080"/>
+        </w:tabs>
+        <w:spacing w:before="280" w:after="280" w:line="360" w:lineRule="auto"/>
+        <w:ind w:left="1077" w:hanging="357"/>
         <w:jc w:val="both"/>
         <w:rPr>
           <w:b/>
@@ -431,13 +370,11 @@
     </w:p>
     <w:p>
       <w:pPr>
-        <w:pStyle w:val="Normal"/>
-        <w:tabs>
-          <w:tab w:val="clear" w:pos="720"/>
-          <w:tab w:val="left" w:pos="1710" w:leader="none"/>
-        </w:tabs>
-        <w:spacing w:lineRule="auto" w:line="360"/>
-        <w:ind w:hanging="90" w:start="810" w:end="0"/>
+        <w:tabs>
+          <w:tab w:val="left" w:pos="1710"/>
+        </w:tabs>
+        <w:spacing w:line="360" w:lineRule="auto"/>
+        <w:ind w:left="810" w:hanging="90"/>
         <w:jc w:val="both"/>
         <w:rPr>
           <w:b/>
@@ -455,9 +392,8 @@
     </w:p>
     <w:p>
       <w:pPr>
-        <w:pStyle w:val="Normal"/>
-        <w:spacing w:lineRule="auto" w:line="336"/>
-        <w:ind w:start="720" w:end="0"/>
+        <w:spacing w:line="336" w:lineRule="auto"/>
+        <w:ind w:left="720"/>
         <w:jc w:val="both"/>
         <w:rPr>
           <w:color w:val="000000"/>
@@ -469,105 +405,56 @@
         </w:rPr>
         <w:t>- Địa chỉ: {{DIA_CHI_KHACH_HANG}}</w:t>
       </w:r>
-      <w:r>
-        <w:rPr>
-          <w:bCs/>
+    </w:p>
+    <w:p>
+      <w:pPr>
+        <w:spacing w:line="336" w:lineRule="auto"/>
+        <w:ind w:left="720"/>
+        <w:jc w:val="both"/>
+        <w:rPr>
           <w:color w:val="000000"/>
-          <w:lang w:val="nl-NL"/>
-        </w:rPr>
-      </w:r>
-      <w:r>
+        </w:rPr>
+      </w:pPr>
+      <w:r>
+        <w:rPr>
+          <w:lang w:val="nl-NL"/>
+        </w:rPr>
+        <w:t>- MST: {{MA_SO_THUE}}</w:t>
+      </w:r>
+    </w:p>
+    <w:p>
+      <w:pPr>
+        <w:spacing w:line="336" w:lineRule="auto"/>
+        <w:ind w:left="720"/>
+        <w:jc w:val="both"/>
         <w:rPr>
           <w:color w:val="000000"/>
-          <w:lang w:val="vi-VN"/>
-        </w:rPr>
-      </w:r>
-      <w:r>
-        <w:rPr>
-          <w:color w:val="000000"/>
-        </w:rPr>
-      </w:r>
-      <w:r>
-        <w:rPr>
-          <w:color w:val="000000"/>
-          <w:lang w:val="vi-VN"/>
-        </w:rPr>
-      </w:r>
-    </w:p>
-    <w:p>
-      <w:pPr>
-        <w:pStyle w:val="Normal"/>
-        <w:spacing w:lineRule="auto" w:line="336"/>
-        <w:ind w:start="720" w:end="0"/>
-        <w:jc w:val="both"/>
-        <w:rPr>
-          <w:color w:val="000000"/>
-        </w:rPr>
-      </w:pPr>
-      <w:r>
-        <w:rPr>
-          <w:lang w:val="nl-NL"/>
-        </w:rPr>
-        <w:t>- MST: {{MA_SO_THUE}}</w:t>
-      </w:r>
-      <w:r>
-        <w:rPr>
-          <w:color w:val="000000"/>
-        </w:rPr>
-      </w:r>
-    </w:p>
-    <w:p>
-      <w:pPr>
-        <w:pStyle w:val="Normal"/>
-        <w:spacing w:lineRule="auto" w:line="336"/>
-        <w:ind w:start="720" w:end="0"/>
-        <w:jc w:val="both"/>
-        <w:rPr>
-          <w:color w:val="000000"/>
-        </w:rPr>
-      </w:pPr>
-      <w:r>
-        <w:rPr>
-          <w:lang w:val="nl-NL"/>
-        </w:rPr>
-        <w:t>- Đại diện: Ông {{NGUOI_DAI_DIEN}}</w:t>
+        </w:rPr>
+      </w:pPr>
+      <w:r>
+        <w:rPr>
+          <w:lang w:val="nl-NL"/>
+        </w:rPr>
+        <w:t>- Đại diện: {{NGUOI_DAI_DIEN}}</w:t>
+      </w:r>
+      <w:r>
+        <w:rPr>
+          <w:lang w:val="nl-NL"/>
+        </w:rPr>
         <w:tab/>
+      </w:r>
+      <w:r>
+        <w:rPr>
+          <w:lang w:val="nl-NL"/>
+        </w:rPr>
         <w:tab/>
         <w:t>- Chức vụ: {{CHUC_VU_NGUOI_DAI_DIEN}}</w:t>
       </w:r>
-      <w:r>
-        <w:rPr>
-          <w:color w:val="000000"/>
-        </w:rPr>
-      </w:r>
-      <w:r>
-        <w:rPr>
-          <w:sz w:val="22"/>
-          <w:szCs w:val="22"/>
-        </w:rPr>
-      </w:r>
-      <w:r>
-        <w:rPr>
-          <w:b/>
-          <w:bCs/>
-          <w:sz w:val="22"/>
-          <w:szCs w:val="22"/>
-        </w:rPr>
-      </w:r>
-      <w:r>
-        <w:rPr>
-          <w:color w:val="000000"/>
-        </w:rPr>
-      </w:r>
-      <w:r>
-        <w:rPr/>
-      </w:r>
-    </w:p>
-    <w:p>
-      <w:pPr>
-        <w:pStyle w:val="Normal"/>
-        <w:spacing w:lineRule="auto" w:line="336"/>
-        <w:ind w:start="720" w:end="0"/>
+    </w:p>
+    <w:p>
+      <w:pPr>
+        <w:spacing w:line="336" w:lineRule="auto"/>
+        <w:ind w:left="720"/>
         <w:jc w:val="both"/>
         <w:rPr>
           <w:bCs/>
@@ -583,72 +470,18 @@
         </w:rPr>
         <w:t>{{CAN_CU_UY_QUYEN}}</w:t>
       </w:r>
-      <w:r>
-        <w:rPr>
-          <w:i/>
-          <w:iCs/>
-          <w:lang w:val="vi-VN"/>
-        </w:rPr>
-      </w:r>
-      <w:r>
-        <w:rPr>
-          <w:i/>
-          <w:iCs/>
-        </w:rPr>
-      </w:r>
-      <w:r>
-        <w:rPr>
-          <w:i/>
-          <w:iCs/>
-          <w:lang w:val="vi-VN"/>
-        </w:rPr>
-      </w:r>
-      <w:r>
-        <w:rPr>
-          <w:i/>
-          <w:iCs/>
-        </w:rPr>
-      </w:r>
-      <w:r>
-        <w:rPr>
-          <w:i/>
-          <w:iCs/>
-          <w:lang w:val="vi-VN"/>
-        </w:rPr>
-      </w:r>
-      <w:r>
-        <w:rPr>
-          <w:i/>
-          <w:iCs/>
-        </w:rPr>
-      </w:r>
-      <w:r>
-        <w:rPr>
-          <w:i/>
-          <w:iCs/>
-          <w:lang w:val="vi-VN"/>
-        </w:rPr>
-      </w:r>
-      <w:r>
-        <w:rPr>
-          <w:i/>
-          <w:iCs/>
-        </w:rPr>
-      </w:r>
-    </w:p>
-    <w:p>
-      <w:pPr>
-        <w:pStyle w:val="Normal"/>
+    </w:p>
+    <w:p>
+      <w:pPr>
         <w:numPr>
           <w:ilvl w:val="0"/>
           <w:numId w:val="3"/>
         </w:numPr>
         <w:tabs>
-          <w:tab w:val="clear" w:pos="720"/>
-          <w:tab w:val="left" w:pos="1080" w:leader="none"/>
-        </w:tabs>
-        <w:spacing w:lineRule="auto" w:line="360" w:before="280" w:after="280"/>
-        <w:ind w:hanging="357" w:start="1077" w:end="0"/>
+          <w:tab w:val="left" w:pos="1080"/>
+        </w:tabs>
+        <w:spacing w:before="280" w:after="280" w:line="360" w:lineRule="auto"/>
+        <w:ind w:left="1077" w:hanging="357"/>
         <w:jc w:val="both"/>
         <w:rPr>
           <w:b/>
@@ -663,11 +496,9 @@
     </w:p>
     <w:p>
       <w:pPr>
-        <w:pStyle w:val="Normal"/>
-        <w:spacing w:lineRule="auto" w:line="360" w:before="120" w:after="0"/>
-        <w:ind w:start="720" w:end="0"/>
+        <w:spacing w:before="120" w:line="360" w:lineRule="auto"/>
+        <w:ind w:left="720"/>
         <w:jc w:val="both"/>
-        <w:rPr/>
       </w:pPr>
       <w:r>
         <w:rPr>
@@ -679,9 +510,8 @@
     </w:p>
     <w:p>
       <w:pPr>
-        <w:pStyle w:val="Normal"/>
-        <w:spacing w:lineRule="auto" w:line="336"/>
-        <w:ind w:start="720" w:end="0"/>
+        <w:spacing w:line="336" w:lineRule="auto"/>
+        <w:ind w:left="720"/>
         <w:jc w:val="both"/>
         <w:rPr>
           <w:lang w:val="nl-NL"/>
@@ -696,42 +526,62 @@
     </w:p>
     <w:p>
       <w:pPr>
-        <w:pStyle w:val="Normal"/>
-        <w:spacing w:lineRule="auto" w:line="336"/>
-        <w:ind w:firstLine="720" w:end="0"/>
+        <w:spacing w:line="336" w:lineRule="auto"/>
+        <w:ind w:firstLine="720"/>
         <w:jc w:val="both"/>
-        <w:rPr/>
       </w:pPr>
       <w:r>
         <w:rPr>
           <w:lang w:val="nl-NL"/>
         </w:rPr>
         <w:t>- Điện thoại</w:t>
+      </w:r>
+      <w:r>
+        <w:rPr>
+          <w:lang w:val="nl-NL"/>
+        </w:rPr>
         <w:tab/>
         <w:t>: (028) 3920 6972</w:t>
+      </w:r>
+      <w:r>
+        <w:rPr>
+          <w:lang w:val="nl-NL"/>
+        </w:rPr>
         <w:tab/>
+      </w:r>
+      <w:r>
+        <w:rPr>
+          <w:lang w:val="nl-NL"/>
+        </w:rPr>
         <w:tab/>
+      </w:r>
+      <w:r>
+        <w:rPr>
+          <w:lang w:val="nl-NL"/>
+        </w:rPr>
         <w:tab/>
       </w:r>
     </w:p>
     <w:p>
       <w:pPr>
-        <w:pStyle w:val="Normal"/>
-        <w:spacing w:lineRule="auto" w:line="336"/>
-        <w:ind w:firstLine="720" w:end="0"/>
+        <w:spacing w:line="336" w:lineRule="auto"/>
+        <w:ind w:firstLine="720"/>
         <w:jc w:val="both"/>
-        <w:rPr/>
       </w:pPr>
       <w:r>
         <w:rPr>
           <w:lang w:val="nl-NL"/>
         </w:rPr>
         <w:t>- Tài khoản số</w:t>
+      </w:r>
+      <w:r>
+        <w:rPr>
+          <w:lang w:val="nl-NL"/>
+        </w:rPr>
         <w:tab/>
         <w:t xml:space="preserve">: </w:t>
       </w:r>
       <w:r>
-        <w:rPr/>
         <w:t>0531002471549</w:t>
       </w:r>
       <w:r>
@@ -739,14 +589,18 @@
           <w:lang w:val="nl-NL"/>
         </w:rPr>
         <w:tab/>
+      </w:r>
+      <w:r>
+        <w:rPr>
+          <w:lang w:val="nl-NL"/>
+        </w:rPr>
         <w:tab/>
       </w:r>
     </w:p>
     <w:p>
       <w:pPr>
-        <w:pStyle w:val="Normal"/>
-        <w:spacing w:lineRule="auto" w:line="336"/>
-        <w:ind w:start="720" w:end="0"/>
+        <w:spacing w:line="336" w:lineRule="auto"/>
+        <w:ind w:left="720"/>
         <w:jc w:val="both"/>
         <w:rPr>
           <w:lang w:val="nl-NL"/>
@@ -757,20 +611,28 @@
           <w:lang w:val="nl-NL"/>
         </w:rPr>
         <w:t>- Tại</w:t>
+      </w:r>
+      <w:r>
+        <w:rPr>
+          <w:lang w:val="nl-NL"/>
+        </w:rPr>
         <w:tab/>
+      </w:r>
+      <w:r>
+        <w:rPr>
+          <w:lang w:val="nl-NL"/>
+        </w:rPr>
         <w:tab/>
         <w:t xml:space="preserve">: </w:t>
       </w:r>
       <w:r>
-        <w:rPr/>
         <w:t>Ngân hàng thương mại cổ phần ngoại thương Việt Nam – Chi nhánh Đông Sài Gòn</w:t>
       </w:r>
     </w:p>
     <w:p>
       <w:pPr>
-        <w:pStyle w:val="Normal"/>
-        <w:spacing w:lineRule="auto" w:line="336"/>
-        <w:ind w:firstLine="720" w:end="0"/>
+        <w:spacing w:line="336" w:lineRule="auto"/>
+        <w:ind w:firstLine="720"/>
         <w:jc w:val="both"/>
         <w:rPr>
           <w:lang w:val="nl-NL"/>
@@ -781,77 +643,104 @@
           <w:lang w:val="nl-NL"/>
         </w:rPr>
         <w:t>- Mã số thuế</w:t>
+      </w:r>
+      <w:r>
+        <w:rPr>
+          <w:lang w:val="nl-NL"/>
+        </w:rPr>
         <w:tab/>
         <w:t>: 0102658944-002</w:t>
       </w:r>
     </w:p>
     <w:p>
       <w:pPr>
-        <w:pStyle w:val="Normal"/>
-        <w:spacing w:lineRule="auto" w:line="336"/>
-        <w:ind w:firstLine="720" w:end="0"/>
+        <w:spacing w:line="336" w:lineRule="auto"/>
+        <w:ind w:firstLine="720"/>
         <w:jc w:val="both"/>
-        <w:rPr/>
       </w:pPr>
       <w:r>
         <w:rPr>
           <w:lang w:val="nl-NL"/>
         </w:rPr>
         <w:t>- Đại diện</w:t>
+      </w:r>
+      <w:r>
+        <w:rPr>
+          <w:lang w:val="nl-NL"/>
+        </w:rPr>
         <w:tab/>
-        <w:t>: Bà ĐẶNG THỊ NHƯ ANH</w:t>
+        <w:t xml:space="preserve">: Bà </w:t>
+      </w:r>
+      <w:r>
+        <w:rPr>
+          <w:lang w:val="nl-NL"/>
+        </w:rPr>
+        <w:t>ĐẶNG THỊ NHƯ ANH</w:t>
+      </w:r>
+      <w:r>
+        <w:rPr>
+          <w:lang w:val="nl-NL"/>
+        </w:rPr>
         <w:tab/>
+      </w:r>
+      <w:r>
+        <w:rPr>
+          <w:lang w:val="nl-NL"/>
+        </w:rPr>
         <w:tab/>
         <w:t>- Chức vụ: Giám đốc chi nhánh</w:t>
       </w:r>
     </w:p>
     <w:p>
       <w:pPr>
-        <w:pStyle w:val="Normal"/>
-        <w:spacing w:lineRule="auto" w:line="360" w:before="60" w:after="60"/>
-        <w:ind w:start="720" w:end="0"/>
+        <w:spacing w:before="60" w:after="60" w:line="360" w:lineRule="auto"/>
+        <w:ind w:left="720"/>
         <w:jc w:val="both"/>
-        <w:rPr/>
       </w:pPr>
       <w:r>
         <w:rPr>
           <w:i/>
           <w:lang w:val="nl-NL"/>
         </w:rPr>
-        <w:t xml:space="preserve"> </w:t>
-      </w:r>
-      <w:r>
-        <w:rPr>
-          <w:i/>
-          <w:lang w:val="nl-NL"/>
-        </w:rPr>
-        <w:t>(Giấy ủy quyền số 01/2023/GUQ-CENVALUE ngày 10 tháng 06 năm 2023 của Công ty Cổ phần Thẩm định giá Thế Kỷ và Công ty Cổ phần Thẩm định giá Thế Kỷ - Chi nhánh tại thành phố Hồ Chí Minh).</w:t>
-      </w:r>
-    </w:p>
-    <w:p>
-      <w:pPr>
-        <w:pStyle w:val="Normal"/>
-        <w:spacing w:lineRule="auto" w:line="360"/>
-        <w:ind w:firstLine="450" w:start="360" w:end="0"/>
+        <w:t xml:space="preserve"> (Giấy ủy quyền số 01/2023/GUQ-CENVALUE ngày 10 tháng 06 năm 2023 của Công ty Cổ phần Thẩm định giá Thế Kỷ và Công ty Cổ phần Thẩm định giá Thế Kỷ - Chi nhánh tại thành phố Hồ Chí Minh).</w:t>
+      </w:r>
+    </w:p>
+    <w:p>
+      <w:pPr>
+        <w:spacing w:line="360" w:lineRule="auto"/>
+        <w:ind w:left="360" w:firstLine="450"/>
         <w:jc w:val="both"/>
-        <w:rPr/>
-      </w:pPr>
-      <w:r>
-        <w:rPr>
-          <w:lang w:val="nl-NL"/>
-        </w:rPr>
-        <w:t>Sau khi trao đổi và thỏa thuận, hai Bên thống nhất ký Biên bản nghiệm thu hoàn thành dịch vụ của Hợp đồng dịch vụ số {{SO_HOP_DONG_VAN_BAN}} ngày 06/10/2025, giữa {{TEN_KHACH_HANG}} và CÔNG TY CỔ PHẦN THẨM ĐỊNH GIÁ THẾ KỶ - CHI NHÁNH TẠI TP HỒ CHÍ MINH với những nội dung sau:</w:t>
-      </w:r>
-      <w:r>
-        <w:rPr>
-          <w:color w:val="FF0000"/>
-          <w:lang w:val="nl-NL"/>
-        </w:rPr>
-      </w:r>
-      <w:r>
-        <w:rPr>
-          <w:lang w:val="nl-NL"/>
-        </w:rPr>
+      </w:pPr>
+      <w:r>
+        <w:rPr>
+          <w:lang w:val="nl-NL"/>
+        </w:rPr>
+        <w:t xml:space="preserve">Sau khi trao đổi và thỏa thuận, hai Bên thống nhất ký Biên bản nghiệm thu hoàn thành dịch vụ của Hợp đồng dịch vụ số {{SO_HOP_DONG_VAN_BAN}} ngày </w:t>
+      </w:r>
+      <w:r>
+        <w:rPr>
+          <w:lang w:val="nl-NL"/>
+        </w:rPr>
+        <w:t>{{NGAY_HOP_DONG}}</w:t>
+      </w:r>
+      <w:r>
+        <w:rPr>
+          <w:lang w:val="nl-NL"/>
+        </w:rPr>
+        <w:t>,</w:t>
+      </w:r>
+      <w:r>
+        <w:rPr>
+          <w:lang w:val="nl-NL"/>
+        </w:rPr>
+        <w:t xml:space="preserve"> giữa </w:t>
+      </w:r>
+      <w:r>
+        <w:rPr>
+          <w:lang w:val="nl-NL"/>
+        </w:rPr>
+        <w:lastRenderedPageBreak/>
+        <w:t>{{TEN_KHACH_HANG}} và CÔNG TY CỔ PHẦN THẨM ĐỊNH GIÁ THẾ KỶ - CHI NHÁNH TẠI TP HỒ CHÍ MINH với những nội dung sau:</w:t>
       </w:r>
     </w:p>
     <w:p>
@@ -862,10 +751,9 @@
           <w:numId w:val="4"/>
         </w:numPr>
         <w:tabs>
-          <w:tab w:val="clear" w:pos="720"/>
-          <w:tab w:val="left" w:pos="180" w:leader="none"/>
-        </w:tabs>
-        <w:spacing w:lineRule="auto" w:line="360"/>
+          <w:tab w:val="left" w:pos="180"/>
+        </w:tabs>
+        <w:spacing w:line="360" w:lineRule="auto"/>
         <w:rPr>
           <w:rFonts w:ascii="Times New Roman" w:hAnsi="Times New Roman" w:cs="Times New Roman"/>
           <w:b/>
@@ -874,7 +762,7 @@
       </w:pPr>
       <w:r>
         <w:rPr>
-          <w:rFonts w:cs="Times New Roman" w:ascii="Times New Roman" w:hAnsi="Times New Roman"/>
+          <w:rFonts w:ascii="Times New Roman" w:hAnsi="Times New Roman" w:cs="Times New Roman"/>
           <w:b/>
           <w:sz w:val="24"/>
         </w:rPr>
@@ -888,7 +776,7 @@
           <w:ilvl w:val="1"/>
           <w:numId w:val="2"/>
         </w:numPr>
-        <w:spacing w:lineRule="auto" w:line="276"/>
+        <w:spacing w:line="276" w:lineRule="auto"/>
         <w:rPr>
           <w:bCs/>
           <w:color w:val="000000"/>
@@ -904,38 +792,34 @@
           <w:sz w:val="24"/>
           <w:szCs w:val="24"/>
         </w:rPr>
-        <w:t>Bên B đã hoàn thành việc cung cấp dịch vụ Thẩm Định giá tài sản đồng thời đã bàn giao đầy đủ hồ sơ theo quy định tại Hợp đồng định giá số: {{SO_HOP_DONG_VAN_BAN}} ngày 06/10/2025 cho bên A cụ thể:</w:t>
-      </w:r>
-      <w:r>
-        <w:rPr>
+        <w:t xml:space="preserve">Bên B đã hoàn thành việc cung cấp dịch vụ Thẩm Định giá tài sản đồng thời đã bàn giao đầy đủ hồ sơ theo quy định tại Hợp đồng định giá số: {{SO_HOP_DONG_VAN_BAN}} ngày </w:t>
+      </w:r>
+      <w:r>
+        <w:rPr>
+          <w:b/>
           <w:bCs/>
           <w:color w:val="000000"/>
           <w:sz w:val="24"/>
           <w:szCs w:val="24"/>
         </w:rPr>
-      </w:r>
-      <w:r>
-        <w:rPr>
-          <w:sz w:val="24"/>
-          <w:szCs w:val="24"/>
-          <w:lang w:val="nl-NL"/>
-        </w:rPr>
-      </w:r>
-      <w:r>
-        <w:rPr>
+        <w:t>{{NGAY_HOP_DONG}}</w:t>
+      </w:r>
+      <w:r>
+        <w:rPr>
+          <w:b/>
           <w:bCs/>
           <w:color w:val="000000"/>
           <w:sz w:val="24"/>
           <w:szCs w:val="24"/>
         </w:rPr>
+        <w:t xml:space="preserve"> cho bên A cụ thể:</w:t>
       </w:r>
     </w:p>
     <w:p>
       <w:pPr>
         <w:pStyle w:val="Thnvnban3"/>
-        <w:spacing w:lineRule="auto" w:line="276"/>
-        <w:ind w:firstLine="720" w:start="720" w:end="0"/>
-        <w:rPr/>
+        <w:spacing w:line="276" w:lineRule="auto"/>
+        <w:ind w:left="720" w:firstLine="720"/>
       </w:pPr>
       <w:r>
         <w:rPr>
@@ -950,9 +834,8 @@
     <w:p>
       <w:pPr>
         <w:pStyle w:val="Thnvnban3"/>
-        <w:spacing w:lineRule="auto" w:line="276"/>
-        <w:ind w:firstLine="450" w:start="990" w:end="0"/>
-        <w:rPr/>
+        <w:spacing w:line="276" w:lineRule="auto"/>
+        <w:ind w:left="990" w:firstLine="450"/>
       </w:pPr>
       <w:r>
         <w:rPr>
@@ -971,7 +854,7 @@
           <w:ilvl w:val="1"/>
           <w:numId w:val="2"/>
         </w:numPr>
-        <w:spacing w:lineRule="auto" w:line="276"/>
+        <w:spacing w:line="276" w:lineRule="auto"/>
         <w:rPr>
           <w:bCs/>
           <w:color w:val="000000"/>
@@ -1002,8 +885,8 @@
     <w:p>
       <w:pPr>
         <w:pStyle w:val="Thnvnban3"/>
-        <w:spacing w:lineRule="auto" w:line="276"/>
-        <w:ind w:firstLine="450" w:start="990" w:end="0"/>
+        <w:spacing w:line="276" w:lineRule="auto"/>
+        <w:ind w:left="990" w:firstLine="450"/>
         <w:rPr>
           <w:bCs/>
           <w:color w:val="000000"/>
@@ -1024,8 +907,8 @@
     <w:p>
       <w:pPr>
         <w:pStyle w:val="Thnvnban3"/>
-        <w:spacing w:lineRule="auto" w:line="276"/>
-        <w:ind w:firstLine="450" w:start="990" w:end="0"/>
+        <w:spacing w:line="276" w:lineRule="auto"/>
+        <w:ind w:left="990" w:firstLine="450"/>
         <w:rPr>
           <w:bCs/>
           <w:color w:val="000000"/>
@@ -1046,8 +929,8 @@
     <w:p>
       <w:pPr>
         <w:pStyle w:val="Thnvnban3"/>
-        <w:spacing w:lineRule="auto" w:line="276"/>
-        <w:ind w:firstLine="450" w:start="990" w:end="0"/>
+        <w:spacing w:line="276" w:lineRule="auto"/>
+        <w:ind w:left="990" w:firstLine="450"/>
         <w:rPr>
           <w:bCs/>
           <w:color w:val="000000"/>
@@ -1068,9 +951,8 @@
     <w:p>
       <w:pPr>
         <w:pStyle w:val="Thnvnban3"/>
-        <w:spacing w:lineRule="auto" w:line="276"/>
-        <w:ind w:firstLine="450" w:start="990" w:end="0"/>
-        <w:rPr/>
+        <w:spacing w:line="276" w:lineRule="auto"/>
+        <w:ind w:left="990" w:firstLine="450"/>
       </w:pPr>
       <w:r>
         <w:rPr>
@@ -1079,7 +961,25 @@
           <w:sz w:val="24"/>
           <w:szCs w:val="24"/>
         </w:rPr>
-        <w:t>+ Hợp đồng dịch vụ thẩm định giá số {{SO_HOP_DONG_VAN_BAN}} ngày 06/10/2025  đã được hoàn thành</w:t>
+        <w:t xml:space="preserve">+ Hợp đồng dịch vụ thẩm định giá số {{SO_HOP_DONG_VAN_BAN}} ngày </w:t>
+      </w:r>
+      <w:r>
+        <w:rPr>
+          <w:bCs/>
+          <w:color w:val="000000"/>
+          <w:sz w:val="24"/>
+          <w:szCs w:val="24"/>
+        </w:rPr>
+        <w:t>{{NGAY_HOP_DONG}}</w:t>
+      </w:r>
+      <w:r>
+        <w:rPr>
+          <w:bCs/>
+          <w:color w:val="000000"/>
+          <w:sz w:val="24"/>
+          <w:szCs w:val="24"/>
+        </w:rPr>
+        <w:t xml:space="preserve">  đã được hoàn thành</w:t>
       </w:r>
     </w:p>
     <w:p>
@@ -1090,10 +990,9 @@
           <w:numId w:val="4"/>
         </w:numPr>
         <w:tabs>
-          <w:tab w:val="clear" w:pos="720"/>
-          <w:tab w:val="left" w:pos="180" w:leader="none"/>
-        </w:tabs>
-        <w:spacing w:lineRule="auto" w:line="360"/>
+          <w:tab w:val="left" w:pos="180"/>
+        </w:tabs>
+        <w:spacing w:line="360" w:lineRule="auto"/>
         <w:rPr>
           <w:rFonts w:ascii="Times New Roman" w:hAnsi="Times New Roman" w:cs="Times New Roman"/>
           <w:b/>
@@ -1102,7 +1001,7 @@
       </w:pPr>
       <w:r>
         <w:rPr>
-          <w:rFonts w:cs="Times New Roman" w:ascii="Times New Roman" w:hAnsi="Times New Roman"/>
+          <w:rFonts w:ascii="Times New Roman" w:hAnsi="Times New Roman" w:cs="Times New Roman"/>
           <w:b/>
           <w:sz w:val="24"/>
         </w:rPr>
@@ -1111,110 +1010,46 @@
     </w:p>
     <w:p>
       <w:pPr>
-        <w:pStyle w:val="Normal"/>
-        <w:spacing w:lineRule="auto" w:line="360" w:before="60" w:after="60"/>
-        <w:ind w:firstLine="720" w:end="0"/>
+        <w:spacing w:before="60" w:after="60" w:line="360" w:lineRule="auto"/>
+        <w:ind w:firstLine="720"/>
         <w:jc w:val="both"/>
-        <w:rPr/>
-      </w:pPr>
-      <w:r>
-        <w:rPr/>
+      </w:pPr>
+      <w:r>
         <w:t>- Tổng phí dịch vụ thẩm định giá theo hợp đồng (đã bao gồm 10% thuế GTGT): {{PHI_THAM_DINH}} VNĐ.</w:t>
       </w:r>
-      <w:r>
-        <w:rPr>
-          <w:lang w:val="vi-VN"/>
-        </w:rPr>
-      </w:r>
-      <w:r>
-        <w:rPr/>
-      </w:r>
-    </w:p>
-    <w:p>
-      <w:pPr>
-        <w:pStyle w:val="Normal"/>
-        <w:spacing w:lineRule="auto" w:line="360" w:before="60" w:after="60"/>
-        <w:ind w:firstLine="720" w:end="0"/>
+    </w:p>
+    <w:p>
+      <w:pPr>
+        <w:spacing w:before="60" w:after="60" w:line="360" w:lineRule="auto"/>
+        <w:ind w:firstLine="720"/>
         <w:jc w:val="both"/>
-        <w:rPr/>
-      </w:pPr>
-      <w:r>
-        <w:rPr/>
+      </w:pPr>
+      <w:r>
         <w:t>- Số tiền Bên A đã thanh toán cho Bên B: {{TAM_UNG}} VNĐ.</w:t>
       </w:r>
-      <w:r>
-        <w:rPr>
-          <w:lang w:val="vi-VN"/>
-        </w:rPr>
-      </w:r>
-      <w:r>
-        <w:rPr/>
-      </w:r>
-      <w:r>
-        <w:rPr>
-          <w:lang w:val="vi-VN"/>
-        </w:rPr>
-      </w:r>
-      <w:r>
-        <w:rPr/>
-      </w:r>
-      <w:r>
-        <w:rPr>
-          <w:lang w:val="vi-VN"/>
-        </w:rPr>
-      </w:r>
-      <w:r>
-        <w:rPr/>
-      </w:r>
-    </w:p>
-    <w:p>
-      <w:pPr>
-        <w:pStyle w:val="Normal"/>
-        <w:spacing w:lineRule="auto" w:line="360" w:before="60" w:after="60"/>
-        <w:ind w:firstLine="720" w:end="0"/>
+    </w:p>
+    <w:p>
+      <w:pPr>
+        <w:spacing w:before="60" w:after="60" w:line="360" w:lineRule="auto"/>
+        <w:ind w:firstLine="720"/>
         <w:jc w:val="both"/>
-        <w:rPr/>
-      </w:pPr>
-      <w:r>
-        <w:rPr/>
-        <w:t>- Số tiền cần thanh toán nốt theo hợp đồng: {{PHI_THAM_DINH}} VNĐ</w:t>
-      </w:r>
-      <w:r>
-        <w:rPr>
-          <w:lang w:val="vi-VN"/>
-        </w:rPr>
-      </w:r>
-      <w:r>
-        <w:rPr/>
-      </w:r>
-      <w:r>
-        <w:rPr>
-          <w:lang w:val="vi-VN"/>
-        </w:rPr>
-      </w:r>
-    </w:p>
-    <w:p>
-      <w:pPr>
-        <w:pStyle w:val="Normal"/>
-        <w:spacing w:lineRule="auto" w:line="360" w:before="60" w:after="60"/>
-        <w:ind w:firstLine="720" w:end="0"/>
+      </w:pPr>
+      <w:r>
+        <w:t>- Số tiền cần thanh toán nốt theo hợp đồng: {{CON_LAI_THANH_TOAN}} VNĐ</w:t>
+      </w:r>
+    </w:p>
+    <w:p>
+      <w:pPr>
+        <w:spacing w:before="60" w:after="60" w:line="360" w:lineRule="auto"/>
+        <w:ind w:firstLine="720"/>
         <w:jc w:val="both"/>
-        <w:rPr/>
       </w:pPr>
       <w:r>
         <w:rPr>
           <w:u w:val="single"/>
           <w:lang w:val="vi-VN"/>
         </w:rPr>
-        <w:t>Bằng chữ: {{PHI_THAM_DINH_BANG_CHU}} ./.</w:t>
-      </w:r>
-      <w:r>
-        <w:rPr>
-          <w:lang w:val="vi-VN"/>
-        </w:rPr>
-      </w:r>
-      <w:r>
-        <w:rPr/>
+        <w:t>Bằng chữ: {{CON_LAI_THANH_TOAN_BANG_CHU}} ./.</w:t>
       </w:r>
       <w:r>
         <w:rPr>
@@ -1230,10 +1065,9 @@
           <w:numId w:val="4"/>
         </w:numPr>
         <w:tabs>
-          <w:tab w:val="clear" w:pos="720"/>
-          <w:tab w:val="left" w:pos="180" w:leader="none"/>
-        </w:tabs>
-        <w:spacing w:lineRule="auto" w:line="360"/>
+          <w:tab w:val="left" w:pos="180"/>
+        </w:tabs>
+        <w:spacing w:line="360" w:lineRule="auto"/>
         <w:rPr>
           <w:rFonts w:ascii="Times New Roman" w:hAnsi="Times New Roman" w:cs="Times New Roman"/>
           <w:b/>
@@ -1242,7 +1076,7 @@
       </w:pPr>
       <w:r>
         <w:rPr>
-          <w:rFonts w:cs="Times New Roman" w:ascii="Times New Roman" w:hAnsi="Times New Roman"/>
+          <w:rFonts w:ascii="Times New Roman" w:hAnsi="Times New Roman" w:cs="Times New Roman"/>
           <w:b/>
           <w:sz w:val="24"/>
         </w:rPr>
@@ -1251,27 +1085,21 @@
     </w:p>
     <w:p>
       <w:pPr>
-        <w:pStyle w:val="Normal"/>
-        <w:spacing w:lineRule="auto" w:line="360" w:before="60" w:after="60"/>
-        <w:ind w:start="720" w:end="0"/>
+        <w:spacing w:before="60" w:after="60" w:line="360" w:lineRule="auto"/>
+        <w:ind w:left="720"/>
         <w:jc w:val="both"/>
-        <w:rPr/>
-      </w:pPr>
-      <w:r>
-        <w:rPr/>
+      </w:pPr>
+      <w:r>
         <w:t>- Bên A đã xem xét, kiểm tra kỹ lưỡng chất lượng Chứng thư thẩm định giá.</w:t>
       </w:r>
     </w:p>
     <w:p>
       <w:pPr>
-        <w:pStyle w:val="Normal"/>
-        <w:spacing w:lineRule="auto" w:line="360" w:before="60" w:after="60"/>
-        <w:ind w:start="720" w:end="0"/>
+        <w:spacing w:before="60" w:after="60" w:line="360" w:lineRule="auto"/>
+        <w:ind w:left="720"/>
         <w:jc w:val="both"/>
-        <w:rPr/>
-      </w:pPr>
-      <w:r>
-        <w:rPr/>
+      </w:pPr>
+      <w:r>
         <w:t>- Hai bên thống nhất hoàn thành đầy đủ các nghĩa vụ theo hợp đồng và không có khiếu nại, tranh chấp phát sinh sau khi thanh lý hợp đồng</w:t>
       </w:r>
     </w:p>
@@ -1279,11 +1107,11 @@
       <w:pPr>
         <w:pStyle w:val="Thnvnban3"/>
         <w:tabs>
-          <w:tab w:val="left" w:pos="360" w:leader="none"/>
-          <w:tab w:val="left" w:pos="720" w:leader="none"/>
-        </w:tabs>
-        <w:spacing w:lineRule="auto" w:line="360" w:before="0" w:after="0"/>
-        <w:ind w:firstLine="360" w:start="360" w:end="0"/>
+          <w:tab w:val="left" w:pos="360"/>
+          <w:tab w:val="left" w:pos="720"/>
+        </w:tabs>
+        <w:spacing w:after="0" w:line="360" w:lineRule="auto"/>
+        <w:ind w:left="360" w:firstLine="360"/>
         <w:rPr>
           <w:color w:val="000000"/>
           <w:sz w:val="24"/>
@@ -1304,15 +1132,9 @@
     <w:tbl>
       <w:tblPr>
         <w:tblW w:w="10314" w:type="dxa"/>
-        <w:jc w:val="start"/>
         <w:tblInd w:w="675" w:type="dxa"/>
         <w:tblLayout w:type="fixed"/>
-        <w:tblCellMar>
-          <w:top w:w="0" w:type="dxa"/>
-          <w:start w:w="108" w:type="dxa"/>
-          <w:bottom w:w="0" w:type="dxa"/>
-          <w:end w:w="108" w:type="dxa"/>
-        </w:tblCellMar>
+        <w:tblLook w:val="04A0" w:firstRow="1" w:lastRow="0" w:firstColumn="1" w:lastColumn="0" w:noHBand="0" w:noVBand="1"/>
       </w:tblPr>
       <w:tblGrid>
         <w:gridCol w:w="4968"/>
@@ -1320,20 +1142,17 @@
       </w:tblGrid>
       <w:tr>
         <w:trPr>
-          <w:trHeight w:val="74" w:hRule="atLeast"/>
+          <w:trHeight w:val="74"/>
         </w:trPr>
         <w:tc>
           <w:tcPr>
             <w:tcW w:w="4968" w:type="dxa"/>
-            <w:tcBorders/>
           </w:tcPr>
           <w:p>
             <w:pPr>
-              <w:pStyle w:val="Normal"/>
               <w:tabs>
-                <w:tab w:val="clear" w:pos="720"/>
-                <w:tab w:val="center" w:pos="1800" w:leader="none"/>
-                <w:tab w:val="center" w:pos="7920" w:leader="none"/>
+                <w:tab w:val="center" w:pos="1800"/>
+                <w:tab w:val="center" w:pos="7920"/>
               </w:tabs>
               <w:spacing w:before="60" w:after="60"/>
               <w:jc w:val="center"/>
@@ -1350,11 +1169,9 @@
           </w:p>
           <w:p>
             <w:pPr>
-              <w:pStyle w:val="Normal"/>
               <w:tabs>
-                <w:tab w:val="clear" w:pos="720"/>
-                <w:tab w:val="center" w:pos="1800" w:leader="none"/>
-                <w:tab w:val="center" w:pos="7920" w:leader="none"/>
+                <w:tab w:val="center" w:pos="1800"/>
+                <w:tab w:val="center" w:pos="7920"/>
               </w:tabs>
               <w:spacing w:before="60" w:after="60"/>
               <w:jc w:val="center"/>
@@ -1371,11 +1188,9 @@
           </w:p>
           <w:p>
             <w:pPr>
-              <w:pStyle w:val="Normal"/>
               <w:tabs>
-                <w:tab w:val="clear" w:pos="720"/>
-                <w:tab w:val="center" w:pos="1800" w:leader="none"/>
-                <w:tab w:val="center" w:pos="7920" w:leader="none"/>
+                <w:tab w:val="center" w:pos="1800"/>
+                <w:tab w:val="center" w:pos="7920"/>
               </w:tabs>
               <w:spacing w:before="60" w:after="60"/>
               <w:jc w:val="center"/>
@@ -1383,19 +1198,12 @@
                 <w:b/>
               </w:rPr>
             </w:pPr>
-            <w:r>
-              <w:rPr>
-                <w:b/>
-              </w:rPr>
-            </w:r>
           </w:p>
           <w:p>
             <w:pPr>
-              <w:pStyle w:val="Normal"/>
               <w:tabs>
-                <w:tab w:val="clear" w:pos="720"/>
-                <w:tab w:val="center" w:pos="1800" w:leader="none"/>
-                <w:tab w:val="center" w:pos="7920" w:leader="none"/>
+                <w:tab w:val="center" w:pos="1800"/>
+                <w:tab w:val="center" w:pos="7920"/>
               </w:tabs>
               <w:spacing w:before="60" w:after="60"/>
               <w:jc w:val="center"/>
@@ -1403,19 +1211,12 @@
                 <w:b/>
               </w:rPr>
             </w:pPr>
-            <w:r>
-              <w:rPr>
-                <w:b/>
-              </w:rPr>
-            </w:r>
           </w:p>
           <w:p>
             <w:pPr>
-              <w:pStyle w:val="Normal"/>
               <w:tabs>
-                <w:tab w:val="clear" w:pos="720"/>
-                <w:tab w:val="center" w:pos="1800" w:leader="none"/>
-                <w:tab w:val="center" w:pos="7920" w:leader="none"/>
+                <w:tab w:val="center" w:pos="1800"/>
+                <w:tab w:val="center" w:pos="7920"/>
               </w:tabs>
               <w:spacing w:before="60" w:after="60"/>
               <w:jc w:val="center"/>
@@ -1423,19 +1224,12 @@
                 <w:b/>
               </w:rPr>
             </w:pPr>
-            <w:r>
-              <w:rPr>
-                <w:b/>
-              </w:rPr>
-            </w:r>
           </w:p>
           <w:p>
             <w:pPr>
-              <w:pStyle w:val="Normal"/>
               <w:tabs>
-                <w:tab w:val="clear" w:pos="720"/>
-                <w:tab w:val="center" w:pos="1800" w:leader="none"/>
-                <w:tab w:val="center" w:pos="7920" w:leader="none"/>
+                <w:tab w:val="center" w:pos="1800"/>
+                <w:tab w:val="center" w:pos="7920"/>
               </w:tabs>
               <w:spacing w:before="60" w:after="60"/>
               <w:jc w:val="center"/>
@@ -1443,19 +1237,12 @@
                 <w:b/>
               </w:rPr>
             </w:pPr>
-            <w:r>
-              <w:rPr>
-                <w:b/>
-              </w:rPr>
-            </w:r>
           </w:p>
           <w:p>
             <w:pPr>
-              <w:pStyle w:val="Normal"/>
               <w:tabs>
-                <w:tab w:val="clear" w:pos="720"/>
-                <w:tab w:val="center" w:pos="1800" w:leader="none"/>
-                <w:tab w:val="center" w:pos="7920" w:leader="none"/>
+                <w:tab w:val="center" w:pos="1800"/>
+                <w:tab w:val="center" w:pos="7920"/>
               </w:tabs>
               <w:spacing w:before="60" w:after="60"/>
               <w:jc w:val="center"/>
@@ -1463,19 +1250,12 @@
                 <w:b/>
               </w:rPr>
             </w:pPr>
-            <w:r>
-              <w:rPr>
-                <w:b/>
-              </w:rPr>
-            </w:r>
           </w:p>
           <w:p>
             <w:pPr>
-              <w:pStyle w:val="Normal"/>
               <w:tabs>
-                <w:tab w:val="clear" w:pos="720"/>
-                <w:tab w:val="center" w:pos="1800" w:leader="none"/>
-                <w:tab w:val="center" w:pos="7920" w:leader="none"/>
+                <w:tab w:val="center" w:pos="1800"/>
+                <w:tab w:val="center" w:pos="7920"/>
               </w:tabs>
               <w:spacing w:before="60" w:after="60"/>
               <w:jc w:val="center"/>
@@ -1483,19 +1263,12 @@
                 <w:b/>
               </w:rPr>
             </w:pPr>
-            <w:r>
-              <w:rPr>
-                <w:b/>
-              </w:rPr>
-            </w:r>
           </w:p>
           <w:p>
             <w:pPr>
-              <w:pStyle w:val="Normal"/>
               <w:tabs>
-                <w:tab w:val="clear" w:pos="720"/>
-                <w:tab w:val="center" w:pos="1800" w:leader="none"/>
-                <w:tab w:val="center" w:pos="7920" w:leader="none"/>
+                <w:tab w:val="center" w:pos="1800"/>
+                <w:tab w:val="center" w:pos="7920"/>
               </w:tabs>
               <w:spacing w:before="60" w:after="60"/>
               <w:jc w:val="center"/>
@@ -1514,15 +1287,12 @@
         <w:tc>
           <w:tcPr>
             <w:tcW w:w="5346" w:type="dxa"/>
-            <w:tcBorders/>
           </w:tcPr>
           <w:p>
             <w:pPr>
-              <w:pStyle w:val="Normal"/>
               <w:tabs>
-                <w:tab w:val="clear" w:pos="720"/>
-                <w:tab w:val="center" w:pos="1800" w:leader="none"/>
-                <w:tab w:val="center" w:pos="7920" w:leader="none"/>
+                <w:tab w:val="center" w:pos="1800"/>
+                <w:tab w:val="center" w:pos="7920"/>
               </w:tabs>
               <w:spacing w:before="60" w:after="60"/>
               <w:jc w:val="center"/>
@@ -1539,11 +1309,9 @@
           </w:p>
           <w:p>
             <w:pPr>
-              <w:pStyle w:val="Normal"/>
               <w:tabs>
-                <w:tab w:val="clear" w:pos="720"/>
-                <w:tab w:val="center" w:pos="1800" w:leader="none"/>
-                <w:tab w:val="center" w:pos="7920" w:leader="none"/>
+                <w:tab w:val="center" w:pos="1800"/>
+                <w:tab w:val="center" w:pos="7920"/>
               </w:tabs>
               <w:spacing w:before="60" w:after="60"/>
               <w:jc w:val="center"/>
@@ -1560,11 +1328,9 @@
           </w:p>
           <w:p>
             <w:pPr>
-              <w:pStyle w:val="Normal"/>
               <w:tabs>
-                <w:tab w:val="clear" w:pos="720"/>
-                <w:tab w:val="center" w:pos="1800" w:leader="none"/>
-                <w:tab w:val="center" w:pos="7920" w:leader="none"/>
+                <w:tab w:val="center" w:pos="1800"/>
+                <w:tab w:val="center" w:pos="7920"/>
               </w:tabs>
               <w:spacing w:before="60" w:after="60"/>
               <w:jc w:val="center"/>
@@ -1572,19 +1338,12 @@
                 <w:b/>
               </w:rPr>
             </w:pPr>
-            <w:r>
-              <w:rPr>
-                <w:b/>
-              </w:rPr>
-            </w:r>
           </w:p>
           <w:p>
             <w:pPr>
-              <w:pStyle w:val="Normal"/>
               <w:tabs>
-                <w:tab w:val="clear" w:pos="720"/>
-                <w:tab w:val="center" w:pos="1800" w:leader="none"/>
-                <w:tab w:val="center" w:pos="7920" w:leader="none"/>
+                <w:tab w:val="center" w:pos="1800"/>
+                <w:tab w:val="center" w:pos="7920"/>
               </w:tabs>
               <w:spacing w:before="60" w:after="60"/>
               <w:jc w:val="center"/>
@@ -1592,19 +1351,12 @@
                 <w:b/>
               </w:rPr>
             </w:pPr>
-            <w:r>
-              <w:rPr>
-                <w:b/>
-              </w:rPr>
-            </w:r>
           </w:p>
           <w:p>
             <w:pPr>
-              <w:pStyle w:val="Normal"/>
               <w:tabs>
-                <w:tab w:val="clear" w:pos="720"/>
-                <w:tab w:val="center" w:pos="1800" w:leader="none"/>
-                <w:tab w:val="center" w:pos="7920" w:leader="none"/>
+                <w:tab w:val="center" w:pos="1800"/>
+                <w:tab w:val="center" w:pos="7920"/>
               </w:tabs>
               <w:spacing w:before="60" w:after="60"/>
               <w:jc w:val="center"/>
@@ -1612,19 +1364,12 @@
                 <w:b/>
               </w:rPr>
             </w:pPr>
-            <w:r>
-              <w:rPr>
-                <w:b/>
-              </w:rPr>
-            </w:r>
           </w:p>
           <w:p>
             <w:pPr>
-              <w:pStyle w:val="Normal"/>
               <w:tabs>
-                <w:tab w:val="clear" w:pos="720"/>
-                <w:tab w:val="center" w:pos="1800" w:leader="none"/>
-                <w:tab w:val="center" w:pos="7920" w:leader="none"/>
+                <w:tab w:val="center" w:pos="1800"/>
+                <w:tab w:val="center" w:pos="7920"/>
               </w:tabs>
               <w:spacing w:before="60" w:after="60"/>
               <w:jc w:val="center"/>
@@ -1632,19 +1377,12 @@
                 <w:b/>
               </w:rPr>
             </w:pPr>
-            <w:r>
-              <w:rPr>
-                <w:b/>
-              </w:rPr>
-            </w:r>
           </w:p>
           <w:p>
             <w:pPr>
-              <w:pStyle w:val="Normal"/>
               <w:tabs>
-                <w:tab w:val="clear" w:pos="720"/>
-                <w:tab w:val="center" w:pos="1800" w:leader="none"/>
-                <w:tab w:val="center" w:pos="7920" w:leader="none"/>
+                <w:tab w:val="center" w:pos="1800"/>
+                <w:tab w:val="center" w:pos="7920"/>
               </w:tabs>
               <w:spacing w:before="60" w:after="60"/>
               <w:jc w:val="center"/>
@@ -1652,19 +1390,12 @@
                 <w:b/>
               </w:rPr>
             </w:pPr>
-            <w:r>
-              <w:rPr>
-                <w:b/>
-              </w:rPr>
-            </w:r>
           </w:p>
           <w:p>
             <w:pPr>
-              <w:pStyle w:val="Normal"/>
               <w:tabs>
-                <w:tab w:val="clear" w:pos="720"/>
-                <w:tab w:val="center" w:pos="1800" w:leader="none"/>
-                <w:tab w:val="center" w:pos="7920" w:leader="none"/>
+                <w:tab w:val="center" w:pos="1800"/>
+                <w:tab w:val="center" w:pos="7920"/>
               </w:tabs>
               <w:spacing w:before="60" w:after="60"/>
               <w:jc w:val="center"/>
@@ -1672,19 +1403,12 @@
                 <w:b/>
               </w:rPr>
             </w:pPr>
-            <w:r>
-              <w:rPr>
-                <w:b/>
-              </w:rPr>
-            </w:r>
           </w:p>
           <w:p>
             <w:pPr>
-              <w:pStyle w:val="Normal"/>
               <w:tabs>
-                <w:tab w:val="clear" w:pos="720"/>
-                <w:tab w:val="center" w:pos="1800" w:leader="none"/>
-                <w:tab w:val="center" w:pos="7920" w:leader="none"/>
+                <w:tab w:val="center" w:pos="1800"/>
+                <w:tab w:val="center" w:pos="7920"/>
               </w:tabs>
               <w:spacing w:before="60" w:after="60"/>
               <w:jc w:val="center"/>
@@ -1706,10 +1430,10 @@
       <w:pPr>
         <w:pStyle w:val="Thnvnban3"/>
         <w:tabs>
-          <w:tab w:val="left" w:pos="360" w:leader="none"/>
-          <w:tab w:val="left" w:pos="720" w:leader="none"/>
-        </w:tabs>
-        <w:spacing w:lineRule="auto" w:line="360" w:before="0" w:after="0"/>
+          <w:tab w:val="left" w:pos="360"/>
+          <w:tab w:val="left" w:pos="720"/>
+        </w:tabs>
+        <w:spacing w:after="0" w:line="360" w:lineRule="auto"/>
         <w:contextualSpacing/>
         <w:rPr>
           <w:color w:val="000000"/>
@@ -1717,31 +1441,41 @@
           <w:szCs w:val="24"/>
         </w:rPr>
       </w:pPr>
-      <w:r>
-        <w:rPr>
-          <w:color w:val="000000"/>
-          <w:sz w:val="24"/>
-          <w:szCs w:val="24"/>
-        </w:rPr>
-      </w:r>
     </w:p>
     <w:sectPr>
-      <w:headerReference w:type="default" r:id="rId2"/>
-      <w:footerReference w:type="default" r:id="rId3"/>
-      <w:type w:val="nextPage"/>
+      <w:headerReference w:type="default" r:id="rId7"/>
+      <w:footerReference w:type="default" r:id="rId8"/>
       <w:pgSz w:w="11906" w:h="16838"/>
-      <w:pgMar w:left="634" w:right="1195" w:gutter="0" w:header="432" w:top="634" w:footer="288" w:bottom="344"/>
-      <w:pgNumType w:fmt="decimal"/>
-      <w:formProt w:val="false"/>
-      <w:textDirection w:val="lrTb"/>
-      <w:docGrid w:type="default" w:linePitch="360" w:charSpace="0"/>
+      <w:pgMar w:top="634" w:right="1195" w:bottom="344" w:left="634" w:header="432" w:footer="288" w:gutter="0"/>
+      <w:cols w:space="720"/>
+      <w:formProt w:val="0"/>
+      <w:docGrid w:linePitch="360"/>
     </w:sectPr>
   </w:body>
 </w:document>
 </file>
 
+<file path=word/endnotes.xml><?xml version="1.0" encoding="utf-8"?>
+<w:endnotes xmlns:wpc="http://schemas.microsoft.com/office/word/2010/wordprocessingCanvas" xmlns:cx="http://schemas.microsoft.com/office/drawing/2014/chartex" xmlns:cx1="http://schemas.microsoft.com/office/drawing/2015/9/8/chartex" xmlns:cx2="http://schemas.microsoft.com/office/drawing/2015/10/21/chartex" xmlns:cx3="http://schemas.microsoft.com/office/drawing/2016/5/9/chartex" xmlns:cx4="http://schemas.microsoft.com/office/drawing/2016/5/10/chartex" xmlns:cx5="http://schemas.microsoft.com/office/drawing/2016/5/11/chartex" xmlns:cx6="http://schemas.microsoft.com/office/drawing/2016/5/12/chartex" xmlns:cx7="http://schemas.microsoft.com/office/drawing/2016/5/13/chartex" xmlns:cx8="http://schemas.microsoft.com/office/drawing/2016/5/14/chartex" xmlns:mc="http://schemas.openxmlformats.org/markup-compatibility/2006" xmlns:aink="http://schemas.microsoft.com/office/drawing/2016/ink" xmlns:am3d="http://schemas.microsoft.com/office/drawing/2017/model3d" xmlns:o="urn:schemas-microsoft-com:office:office" xmlns:oel="http://schemas.microsoft.com/office/2019/extlst" xmlns:r="http://schemas.openxmlformats.org/officeDocument/2006/relationships" xmlns:m="http://schemas.openxmlformats.org/officeDocument/2006/math" xmlns:v="urn:schemas-microsoft-com:vml" xmlns:wp14="http://schemas.microsoft.com/office/word/2010/wordprocessingDrawing" xmlns:wp="http://schemas.openxmlformats.org/drawingml/2006/wordprocessingDrawing" xmlns:w10="urn:schemas-microsoft-com:office:word" xmlns:w="http://schemas.openxmlformats.org/wordprocessingml/2006/main" xmlns:w14="http://schemas.microsoft.com/office/word/2010/wordml" xmlns:w15="http://schemas.microsoft.com/office/word/2012/wordml" xmlns:w16cex="http://schemas.microsoft.com/office/word/2018/wordml/cex" xmlns:w16cid="http://schemas.microsoft.com/office/word/2016/wordml/cid" xmlns:w16="http://schemas.microsoft.com/office/word/2018/wordml" xmlns:w16du="http://schemas.microsoft.com/office/word/2023/wordml/word16du" xmlns:w16sdtdh="http://schemas.microsoft.com/office/word/2020/wordml/sdtdatahash" xmlns:w16sdtfl="http://schemas.microsoft.com/office/word/2024/wordml/sdtformatlock" xmlns:w16se="http://schemas.microsoft.com/office/word/2015/wordml/symex" xmlns:wpg="http://schemas.microsoft.com/office/word/2010/wordprocessingGroup" xmlns:wpi="http://schemas.microsoft.com/office/word/2010/wordprocessingInk" xmlns:wne="http://schemas.microsoft.com/office/word/2006/wordml" xmlns:wps="http://schemas.microsoft.com/office/word/2010/wordprocessingShape" mc:Ignorable="w14 w15 w16se w16cid w16 w16cex w16sdtdh w16sdtfl w16du wp14">
+  <w:endnote w:type="separator" w:id="-1">
+    <w:p>
+      <w:r>
+        <w:separator/>
+      </w:r>
+    </w:p>
+  </w:endnote>
+  <w:endnote w:type="continuationSeparator" w:id="0">
+    <w:p>
+      <w:r>
+        <w:continuationSeparator/>
+      </w:r>
+    </w:p>
+  </w:endnote>
+</w:endnotes>
+</file>
+
 <file path=word/footer1.xml><?xml version="1.0" encoding="utf-8"?>
-<w:ftr xmlns:o="urn:schemas-microsoft-com:office:office" xmlns:r="http://schemas.openxmlformats.org/officeDocument/2006/relationships" xmlns:v="urn:schemas-microsoft-com:vml" xmlns:w="http://schemas.openxmlformats.org/wordprocessingml/2006/main" xmlns:w10="urn:schemas-microsoft-com:office:word" xmlns:wp="http://schemas.openxmlformats.org/drawingml/2006/wordprocessingDrawing" xmlns:pic="http://schemas.openxmlformats.org/drawingml/2006/picture" xmlns:wps="http://schemas.microsoft.com/office/word/2010/wordprocessingShape" xmlns:wpg="http://schemas.microsoft.com/office/word/2010/wordprocessingGroup" xmlns:mc="http://schemas.openxmlformats.org/markup-compatibility/2006" xmlns:wp14="http://schemas.microsoft.com/office/word/2010/wordprocessingDrawing" xmlns:w14="http://schemas.microsoft.com/office/word/2010/wordml" xmlns:w15="http://schemas.microsoft.com/office/word/2012/wordml" mc:Ignorable="w14 wp14 w15">
+<w:ftr xmlns:wpc="http://schemas.microsoft.com/office/word/2010/wordprocessingCanvas" xmlns:cx="http://schemas.microsoft.com/office/drawing/2014/chartex" xmlns:cx1="http://schemas.microsoft.com/office/drawing/2015/9/8/chartex" xmlns:cx2="http://schemas.microsoft.com/office/drawing/2015/10/21/chartex" xmlns:cx3="http://schemas.microsoft.com/office/drawing/2016/5/9/chartex" xmlns:cx4="http://schemas.microsoft.com/office/drawing/2016/5/10/chartex" xmlns:cx5="http://schemas.microsoft.com/office/drawing/2016/5/11/chartex" xmlns:cx6="http://schemas.microsoft.com/office/drawing/2016/5/12/chartex" xmlns:cx7="http://schemas.microsoft.com/office/drawing/2016/5/13/chartex" xmlns:cx8="http://schemas.microsoft.com/office/drawing/2016/5/14/chartex" xmlns:mc="http://schemas.openxmlformats.org/markup-compatibility/2006" xmlns:aink="http://schemas.microsoft.com/office/drawing/2016/ink" xmlns:am3d="http://schemas.microsoft.com/office/drawing/2017/model3d" xmlns:o="urn:schemas-microsoft-com:office:office" xmlns:oel="http://schemas.microsoft.com/office/2019/extlst" xmlns:r="http://schemas.openxmlformats.org/officeDocument/2006/relationships" xmlns:m="http://schemas.openxmlformats.org/officeDocument/2006/math" xmlns:v="urn:schemas-microsoft-com:vml" xmlns:wp14="http://schemas.microsoft.com/office/word/2010/wordprocessingDrawing" xmlns:wp="http://schemas.openxmlformats.org/drawingml/2006/wordprocessingDrawing" xmlns:w10="urn:schemas-microsoft-com:office:word" xmlns:w="http://schemas.openxmlformats.org/wordprocessingml/2006/main" xmlns:w14="http://schemas.microsoft.com/office/word/2010/wordml" xmlns:w15="http://schemas.microsoft.com/office/word/2012/wordml" xmlns:w16cex="http://schemas.microsoft.com/office/word/2018/wordml/cex" xmlns:w16cid="http://schemas.microsoft.com/office/word/2016/wordml/cid" xmlns:w16="http://schemas.microsoft.com/office/word/2018/wordml" xmlns:w16du="http://schemas.microsoft.com/office/word/2023/wordml/word16du" xmlns:w16sdtdh="http://schemas.microsoft.com/office/word/2020/wordml/sdtdatahash" xmlns:w16sdtfl="http://schemas.microsoft.com/office/word/2024/wordml/sdtformatlock" xmlns:w16se="http://schemas.microsoft.com/office/word/2015/wordml/symex" xmlns:wpg="http://schemas.microsoft.com/office/word/2010/wordprocessingGroup" xmlns:wpi="http://schemas.microsoft.com/office/word/2010/wordprocessingInk" xmlns:wne="http://schemas.microsoft.com/office/word/2006/wordml" xmlns:wps="http://schemas.microsoft.com/office/word/2010/wordprocessingShape" mc:Ignorable="w14 w15 w16se w16cid w16 w16cex w16sdtdh w16sdtfl w16du wp14">
   <w:p>
     <w:pPr>
       <w:pStyle w:val="Footer"/>
@@ -1859,54 +1593,65 @@
   <w:p>
     <w:pPr>
       <w:pStyle w:val="Footer"/>
-      <w:ind w:end="360"/>
-      <w:jc w:val="end"/>
+      <w:ind w:right="360"/>
+      <w:jc w:val="right"/>
       <w:rPr>
         <w:rFonts w:ascii="Tahoma" w:hAnsi="Tahoma" w:cs="Tahoma"/>
         <w:sz w:val="20"/>
         <w:szCs w:val="20"/>
       </w:rPr>
     </w:pPr>
-    <w:r>
-      <w:rPr>
-        <w:rFonts w:cs="Tahoma" w:ascii="Tahoma" w:hAnsi="Tahoma"/>
-        <w:sz w:val="20"/>
-        <w:szCs w:val="20"/>
-      </w:rPr>
-    </w:r>
   </w:p>
 </w:ftr>
 </file>
 
+<file path=word/footnotes.xml><?xml version="1.0" encoding="utf-8"?>
+<w:footnotes xmlns:wpc="http://schemas.microsoft.com/office/word/2010/wordprocessingCanvas" xmlns:cx="http://schemas.microsoft.com/office/drawing/2014/chartex" xmlns:cx1="http://schemas.microsoft.com/office/drawing/2015/9/8/chartex" xmlns:cx2="http://schemas.microsoft.com/office/drawing/2015/10/21/chartex" xmlns:cx3="http://schemas.microsoft.com/office/drawing/2016/5/9/chartex" xmlns:cx4="http://schemas.microsoft.com/office/drawing/2016/5/10/chartex" xmlns:cx5="http://schemas.microsoft.com/office/drawing/2016/5/11/chartex" xmlns:cx6="http://schemas.microsoft.com/office/drawing/2016/5/12/chartex" xmlns:cx7="http://schemas.microsoft.com/office/drawing/2016/5/13/chartex" xmlns:cx8="http://schemas.microsoft.com/office/drawing/2016/5/14/chartex" xmlns:mc="http://schemas.openxmlformats.org/markup-compatibility/2006" xmlns:aink="http://schemas.microsoft.com/office/drawing/2016/ink" xmlns:am3d="http://schemas.microsoft.com/office/drawing/2017/model3d" xmlns:o="urn:schemas-microsoft-com:office:office" xmlns:oel="http://schemas.microsoft.com/office/2019/extlst" xmlns:r="http://schemas.openxmlformats.org/officeDocument/2006/relationships" xmlns:m="http://schemas.openxmlformats.org/officeDocument/2006/math" xmlns:v="urn:schemas-microsoft-com:vml" xmlns:wp14="http://schemas.microsoft.com/office/word/2010/wordprocessingDrawing" xmlns:wp="http://schemas.openxmlformats.org/drawingml/2006/wordprocessingDrawing" xmlns:w10="urn:schemas-microsoft-com:office:word" xmlns:w="http://schemas.openxmlformats.org/wordprocessingml/2006/main" xmlns:w14="http://schemas.microsoft.com/office/word/2010/wordml" xmlns:w15="http://schemas.microsoft.com/office/word/2012/wordml" xmlns:w16cex="http://schemas.microsoft.com/office/word/2018/wordml/cex" xmlns:w16cid="http://schemas.microsoft.com/office/word/2016/wordml/cid" xmlns:w16="http://schemas.microsoft.com/office/word/2018/wordml" xmlns:w16du="http://schemas.microsoft.com/office/word/2023/wordml/word16du" xmlns:w16sdtdh="http://schemas.microsoft.com/office/word/2020/wordml/sdtdatahash" xmlns:w16sdtfl="http://schemas.microsoft.com/office/word/2024/wordml/sdtformatlock" xmlns:w16se="http://schemas.microsoft.com/office/word/2015/wordml/symex" xmlns:wpg="http://schemas.microsoft.com/office/word/2010/wordprocessingGroup" xmlns:wpi="http://schemas.microsoft.com/office/word/2010/wordprocessingInk" xmlns:wne="http://schemas.microsoft.com/office/word/2006/wordml" xmlns:wps="http://schemas.microsoft.com/office/word/2010/wordprocessingShape" mc:Ignorable="w14 w15 w16se w16cid w16 w16cex w16sdtdh w16sdtfl w16du wp14">
+  <w:footnote w:type="separator" w:id="-1">
+    <w:p>
+      <w:r>
+        <w:separator/>
+      </w:r>
+    </w:p>
+  </w:footnote>
+  <w:footnote w:type="continuationSeparator" w:id="0">
+    <w:p>
+      <w:r>
+        <w:continuationSeparator/>
+      </w:r>
+    </w:p>
+  </w:footnote>
+</w:footnotes>
+</file>
+
 <file path=word/header1.xml><?xml version="1.0" encoding="utf-8"?>
-<w:hdr xmlns:o="urn:schemas-microsoft-com:office:office" xmlns:r="http://schemas.openxmlformats.org/officeDocument/2006/relationships" xmlns:v="urn:schemas-microsoft-com:vml" xmlns:w="http://schemas.openxmlformats.org/wordprocessingml/2006/main" xmlns:w10="urn:schemas-microsoft-com:office:word" xmlns:wp="http://schemas.openxmlformats.org/drawingml/2006/wordprocessingDrawing" xmlns:pic="http://schemas.openxmlformats.org/drawingml/2006/picture" xmlns:wps="http://schemas.microsoft.com/office/word/2010/wordprocessingShape" xmlns:wpg="http://schemas.microsoft.com/office/word/2010/wordprocessingGroup" xmlns:mc="http://schemas.openxmlformats.org/markup-compatibility/2006" xmlns:wp14="http://schemas.microsoft.com/office/word/2010/wordprocessingDrawing" xmlns:w14="http://schemas.microsoft.com/office/word/2010/wordml" xmlns:w15="http://schemas.microsoft.com/office/word/2012/wordml" mc:Ignorable="w14 wp14 w15">
+<w:hdr xmlns:wpc="http://schemas.microsoft.com/office/word/2010/wordprocessingCanvas" xmlns:cx="http://schemas.microsoft.com/office/drawing/2014/chartex" xmlns:cx1="http://schemas.microsoft.com/office/drawing/2015/9/8/chartex" xmlns:cx2="http://schemas.microsoft.com/office/drawing/2015/10/21/chartex" xmlns:cx3="http://schemas.microsoft.com/office/drawing/2016/5/9/chartex" xmlns:cx4="http://schemas.microsoft.com/office/drawing/2016/5/10/chartex" xmlns:cx5="http://schemas.microsoft.com/office/drawing/2016/5/11/chartex" xmlns:cx6="http://schemas.microsoft.com/office/drawing/2016/5/12/chartex" xmlns:cx7="http://schemas.microsoft.com/office/drawing/2016/5/13/chartex" xmlns:cx8="http://schemas.microsoft.com/office/drawing/2016/5/14/chartex" xmlns:mc="http://schemas.openxmlformats.org/markup-compatibility/2006" xmlns:aink="http://schemas.microsoft.com/office/drawing/2016/ink" xmlns:am3d="http://schemas.microsoft.com/office/drawing/2017/model3d" xmlns:o="urn:schemas-microsoft-com:office:office" xmlns:oel="http://schemas.microsoft.com/office/2019/extlst" xmlns:r="http://schemas.openxmlformats.org/officeDocument/2006/relationships" xmlns:m="http://schemas.openxmlformats.org/officeDocument/2006/math" xmlns:v="urn:schemas-microsoft-com:vml" xmlns:wp14="http://schemas.microsoft.com/office/word/2010/wordprocessingDrawing" xmlns:wp="http://schemas.openxmlformats.org/drawingml/2006/wordprocessingDrawing" xmlns:w10="urn:schemas-microsoft-com:office:word" xmlns:w="http://schemas.openxmlformats.org/wordprocessingml/2006/main" xmlns:w14="http://schemas.microsoft.com/office/word/2010/wordml" xmlns:w15="http://schemas.microsoft.com/office/word/2012/wordml" xmlns:w16cex="http://schemas.microsoft.com/office/word/2018/wordml/cex" xmlns:w16cid="http://schemas.microsoft.com/office/word/2016/wordml/cid" xmlns:w16="http://schemas.microsoft.com/office/word/2018/wordml" xmlns:w16du="http://schemas.microsoft.com/office/word/2023/wordml/word16du" xmlns:w16sdtdh="http://schemas.microsoft.com/office/word/2020/wordml/sdtdatahash" xmlns:w16sdtfl="http://schemas.microsoft.com/office/word/2024/wordml/sdtformatlock" xmlns:w16se="http://schemas.microsoft.com/office/word/2015/wordml/symex" xmlns:wpg="http://schemas.microsoft.com/office/word/2010/wordprocessingGroup" xmlns:wpi="http://schemas.microsoft.com/office/word/2010/wordprocessingInk" xmlns:wne="http://schemas.microsoft.com/office/word/2006/wordml" xmlns:wps="http://schemas.microsoft.com/office/word/2010/wordprocessingShape" mc:Ignorable="w14 w15 w16se w16cid w16 w16cex w16sdtdh w16sdtfl w16du wp14">
   <w:p>
     <w:pPr>
       <w:pStyle w:val="Header"/>
-      <w:rPr/>
     </w:pPr>
-    <w:r>
-      <w:rPr/>
-    </w:r>
   </w:p>
 </w:hdr>
 </file>
 
 <file path=word/numbering.xml><?xml version="1.0" encoding="utf-8"?>
-<w:numbering xmlns:w="http://schemas.openxmlformats.org/wordprocessingml/2006/main" xmlns:o="urn:schemas-microsoft-com:office:office" xmlns:r="http://schemas.openxmlformats.org/officeDocument/2006/relationships" xmlns:v="urn:schemas-microsoft-com:vml" xmlns:mc="http://schemas.openxmlformats.org/markup-compatibility/2006" xmlns:w14="http://schemas.microsoft.com/office/word/2010/wordml" mc:Ignorable="w14">
-  <w:abstractNum w:abstractNumId="1">
+<w:numbering xmlns:wpc="http://schemas.microsoft.com/office/word/2010/wordprocessingCanvas" xmlns:cx="http://schemas.microsoft.com/office/drawing/2014/chartex" xmlns:cx1="http://schemas.microsoft.com/office/drawing/2015/9/8/chartex" xmlns:cx2="http://schemas.microsoft.com/office/drawing/2015/10/21/chartex" xmlns:cx3="http://schemas.microsoft.com/office/drawing/2016/5/9/chartex" xmlns:cx4="http://schemas.microsoft.com/office/drawing/2016/5/10/chartex" xmlns:cx5="http://schemas.microsoft.com/office/drawing/2016/5/11/chartex" xmlns:cx6="http://schemas.microsoft.com/office/drawing/2016/5/12/chartex" xmlns:cx7="http://schemas.microsoft.com/office/drawing/2016/5/13/chartex" xmlns:cx8="http://schemas.microsoft.com/office/drawing/2016/5/14/chartex" xmlns:mc="http://schemas.openxmlformats.org/markup-compatibility/2006" xmlns:aink="http://schemas.microsoft.com/office/drawing/2016/ink" xmlns:am3d="http://schemas.microsoft.com/office/drawing/2017/model3d" xmlns:o="urn:schemas-microsoft-com:office:office" xmlns:oel="http://schemas.microsoft.com/office/2019/extlst" xmlns:r="http://schemas.openxmlformats.org/officeDocument/2006/relationships" xmlns:m="http://schemas.openxmlformats.org/officeDocument/2006/math" xmlns:v="urn:schemas-microsoft-com:vml" xmlns:wp14="http://schemas.microsoft.com/office/word/2010/wordprocessingDrawing" xmlns:wp="http://schemas.openxmlformats.org/drawingml/2006/wordprocessingDrawing" xmlns:w10="urn:schemas-microsoft-com:office:word" xmlns:w="http://schemas.openxmlformats.org/wordprocessingml/2006/main" xmlns:w14="http://schemas.microsoft.com/office/word/2010/wordml" xmlns:w15="http://schemas.microsoft.com/office/word/2012/wordml" xmlns:w16cex="http://schemas.microsoft.com/office/word/2018/wordml/cex" xmlns:w16cid="http://schemas.microsoft.com/office/word/2016/wordml/cid" xmlns:w16="http://schemas.microsoft.com/office/word/2018/wordml" xmlns:w16du="http://schemas.microsoft.com/office/word/2023/wordml/word16du" xmlns:w16sdtdh="http://schemas.microsoft.com/office/word/2020/wordml/sdtdatahash" xmlns:w16sdtfl="http://schemas.microsoft.com/office/word/2024/wordml/sdtformatlock" xmlns:w16se="http://schemas.microsoft.com/office/word/2015/wordml/symex" xmlns:wpg="http://schemas.microsoft.com/office/word/2010/wordprocessingGroup" xmlns:wpi="http://schemas.microsoft.com/office/word/2010/wordprocessingInk" xmlns:wne="http://schemas.microsoft.com/office/word/2006/wordml" xmlns:wps="http://schemas.microsoft.com/office/word/2010/wordprocessingShape" mc:Ignorable="w14 w15 w16se w16cid w16 w16cex w16sdtdh w16sdtfl w16du wp14">
+  <w:abstractNum w:abstractNumId="0" w15:restartNumberingAfterBreak="0">
+    <w:nsid w:val="4328248F"/>
+    <w:multiLevelType w:val="multilevel"/>
+    <w:tmpl w:val="93E07AFC"/>
     <w:lvl w:ilvl="0">
       <w:start w:val="1"/>
       <w:numFmt w:val="none"/>
       <w:pStyle w:val="Heading1"/>
       <w:suff w:val="nothing"/>
       <w:lvlText w:val=""/>
-      <w:lvlJc w:val="start"/>
+      <w:lvlJc w:val="left"/>
       <w:pPr>
         <w:tabs>
           <w:tab w:val="num" w:pos="0"/>
         </w:tabs>
-        <w:ind w:start="0" w:hanging="0"/>
+        <w:ind w:left="0" w:firstLine="0"/>
       </w:pPr>
     </w:lvl>
     <w:lvl w:ilvl="1">
@@ -1914,12 +1659,12 @@
       <w:numFmt w:val="none"/>
       <w:suff w:val="nothing"/>
       <w:lvlText w:val=""/>
-      <w:lvlJc w:val="start"/>
+      <w:lvlJc w:val="left"/>
       <w:pPr>
         <w:tabs>
           <w:tab w:val="num" w:pos="0"/>
         </w:tabs>
-        <w:ind w:start="0" w:hanging="0"/>
+        <w:ind w:left="0" w:firstLine="0"/>
       </w:pPr>
     </w:lvl>
     <w:lvl w:ilvl="2">
@@ -1928,12 +1673,12 @@
       <w:pStyle w:val="Heading3"/>
       <w:suff w:val="nothing"/>
       <w:lvlText w:val=""/>
-      <w:lvlJc w:val="start"/>
+      <w:lvlJc w:val="left"/>
       <w:pPr>
         <w:tabs>
           <w:tab w:val="num" w:pos="0"/>
         </w:tabs>
-        <w:ind w:start="0" w:hanging="0"/>
+        <w:ind w:left="0" w:firstLine="0"/>
       </w:pPr>
     </w:lvl>
     <w:lvl w:ilvl="3">
@@ -1941,12 +1686,12 @@
       <w:numFmt w:val="none"/>
       <w:suff w:val="nothing"/>
       <w:lvlText w:val=""/>
-      <w:lvlJc w:val="start"/>
+      <w:lvlJc w:val="left"/>
       <w:pPr>
         <w:tabs>
           <w:tab w:val="num" w:pos="0"/>
         </w:tabs>
-        <w:ind w:start="0" w:hanging="0"/>
+        <w:ind w:left="0" w:firstLine="0"/>
       </w:pPr>
     </w:lvl>
     <w:lvl w:ilvl="4">
@@ -1954,12 +1699,12 @@
       <w:numFmt w:val="none"/>
       <w:suff w:val="nothing"/>
       <w:lvlText w:val=""/>
-      <w:lvlJc w:val="start"/>
+      <w:lvlJc w:val="left"/>
       <w:pPr>
         <w:tabs>
           <w:tab w:val="num" w:pos="0"/>
         </w:tabs>
-        <w:ind w:start="0" w:hanging="0"/>
+        <w:ind w:left="0" w:firstLine="0"/>
       </w:pPr>
     </w:lvl>
     <w:lvl w:ilvl="5">
@@ -1967,12 +1712,12 @@
       <w:numFmt w:val="none"/>
       <w:suff w:val="nothing"/>
       <w:lvlText w:val=""/>
-      <w:lvlJc w:val="start"/>
+      <w:lvlJc w:val="left"/>
       <w:pPr>
         <w:tabs>
           <w:tab w:val="num" w:pos="0"/>
         </w:tabs>
-        <w:ind w:start="0" w:hanging="0"/>
+        <w:ind w:left="0" w:firstLine="0"/>
       </w:pPr>
     </w:lvl>
     <w:lvl w:ilvl="6">
@@ -1980,12 +1725,12 @@
       <w:numFmt w:val="none"/>
       <w:suff w:val="nothing"/>
       <w:lvlText w:val=""/>
-      <w:lvlJc w:val="start"/>
+      <w:lvlJc w:val="left"/>
       <w:pPr>
         <w:tabs>
           <w:tab w:val="num" w:pos="0"/>
         </w:tabs>
-        <w:ind w:start="0" w:hanging="0"/>
+        <w:ind w:left="0" w:firstLine="0"/>
       </w:pPr>
     </w:lvl>
     <w:lvl w:ilvl="7">
@@ -1993,12 +1738,12 @@
       <w:numFmt w:val="none"/>
       <w:suff w:val="nothing"/>
       <w:lvlText w:val=""/>
-      <w:lvlJc w:val="start"/>
+      <w:lvlJc w:val="left"/>
       <w:pPr>
         <w:tabs>
           <w:tab w:val="num" w:pos="0"/>
         </w:tabs>
-        <w:ind w:start="0" w:hanging="0"/>
+        <w:ind w:left="0" w:firstLine="0"/>
       </w:pPr>
     </w:lvl>
     <w:lvl w:ilvl="8">
@@ -2006,25 +1751,28 @@
       <w:numFmt w:val="none"/>
       <w:suff w:val="nothing"/>
       <w:lvlText w:val=""/>
-      <w:lvlJc w:val="start"/>
+      <w:lvlJc w:val="left"/>
       <w:pPr>
         <w:tabs>
           <w:tab w:val="num" w:pos="0"/>
         </w:tabs>
-        <w:ind w:start="0" w:hanging="0"/>
+        <w:ind w:left="0" w:firstLine="0"/>
       </w:pPr>
     </w:lvl>
   </w:abstractNum>
-  <w:abstractNum w:abstractNumId="2">
+  <w:abstractNum w:abstractNumId="1" w15:restartNumberingAfterBreak="0">
+    <w:nsid w:val="4CE81318"/>
+    <w:multiLevelType w:val="multilevel"/>
+    <w:tmpl w:val="6A98B43C"/>
     <w:lvl w:ilvl="0">
       <w:numFmt w:val="bullet"/>
       <w:lvlText w:val="-"/>
-      <w:lvlJc w:val="start"/>
+      <w:lvlJc w:val="left"/>
       <w:pPr>
         <w:tabs>
           <w:tab w:val="num" w:pos="270"/>
         </w:tabs>
-        <w:ind w:start="270" w:hanging="360"/>
+        <w:ind w:left="270" w:hanging="360"/>
       </w:pPr>
       <w:rPr>
         <w:rFonts w:ascii="Times New Roman" w:hAnsi="Times New Roman" w:cs="Times New Roman" w:hint="default"/>
@@ -2034,12 +1782,12 @@
       <w:start w:val="1"/>
       <w:numFmt w:val="bullet"/>
       <w:lvlText w:val="o"/>
-      <w:lvlJc w:val="start"/>
+      <w:lvlJc w:val="left"/>
       <w:pPr>
         <w:tabs>
           <w:tab w:val="num" w:pos="990"/>
         </w:tabs>
-        <w:ind w:start="990" w:hanging="360"/>
+        <w:ind w:left="990" w:hanging="360"/>
       </w:pPr>
       <w:rPr>
         <w:rFonts w:ascii="Courier New" w:hAnsi="Courier New" w:cs="Courier New" w:hint="default"/>
@@ -2049,12 +1797,12 @@
       <w:start w:val="1"/>
       <w:numFmt w:val="bullet"/>
       <w:lvlText w:val=""/>
-      <w:lvlJc w:val="start"/>
+      <w:lvlJc w:val="left"/>
       <w:pPr>
         <w:tabs>
           <w:tab w:val="num" w:pos="1710"/>
         </w:tabs>
-        <w:ind w:start="1710" w:hanging="360"/>
+        <w:ind w:left="1710" w:hanging="360"/>
       </w:pPr>
       <w:rPr>
         <w:rFonts w:ascii="Wingdings" w:hAnsi="Wingdings" w:cs="Wingdings" w:hint="default"/>
@@ -2064,12 +1812,12 @@
       <w:start w:val="1"/>
       <w:numFmt w:val="bullet"/>
       <w:lvlText w:val=""/>
-      <w:lvlJc w:val="start"/>
+      <w:lvlJc w:val="left"/>
       <w:pPr>
         <w:tabs>
           <w:tab w:val="num" w:pos="2430"/>
         </w:tabs>
-        <w:ind w:start="2430" w:hanging="360"/>
+        <w:ind w:left="2430" w:hanging="360"/>
       </w:pPr>
       <w:rPr>
         <w:rFonts w:ascii="Symbol" w:hAnsi="Symbol" w:cs="Symbol" w:hint="default"/>
@@ -2079,12 +1827,12 @@
       <w:start w:val="1"/>
       <w:numFmt w:val="bullet"/>
       <w:lvlText w:val="o"/>
-      <w:lvlJc w:val="start"/>
+      <w:lvlJc w:val="left"/>
       <w:pPr>
         <w:tabs>
           <w:tab w:val="num" w:pos="3150"/>
         </w:tabs>
-        <w:ind w:start="3150" w:hanging="360"/>
+        <w:ind w:left="3150" w:hanging="360"/>
       </w:pPr>
       <w:rPr>
         <w:rFonts w:ascii="Courier New" w:hAnsi="Courier New" w:cs="Courier New" w:hint="default"/>
@@ -2094,12 +1842,12 @@
       <w:start w:val="1"/>
       <w:numFmt w:val="bullet"/>
       <w:lvlText w:val=""/>
-      <w:lvlJc w:val="start"/>
+      <w:lvlJc w:val="left"/>
       <w:pPr>
         <w:tabs>
           <w:tab w:val="num" w:pos="3870"/>
         </w:tabs>
-        <w:ind w:start="3870" w:hanging="360"/>
+        <w:ind w:left="3870" w:hanging="360"/>
       </w:pPr>
       <w:rPr>
         <w:rFonts w:ascii="Wingdings" w:hAnsi="Wingdings" w:cs="Wingdings" w:hint="default"/>
@@ -2109,12 +1857,12 @@
       <w:start w:val="1"/>
       <w:numFmt w:val="bullet"/>
       <w:lvlText w:val=""/>
-      <w:lvlJc w:val="start"/>
+      <w:lvlJc w:val="left"/>
       <w:pPr>
         <w:tabs>
           <w:tab w:val="num" w:pos="4590"/>
         </w:tabs>
-        <w:ind w:start="4590" w:hanging="360"/>
+        <w:ind w:left="4590" w:hanging="360"/>
       </w:pPr>
       <w:rPr>
         <w:rFonts w:ascii="Symbol" w:hAnsi="Symbol" w:cs="Symbol" w:hint="default"/>
@@ -2124,12 +1872,12 @@
       <w:start w:val="1"/>
       <w:numFmt w:val="bullet"/>
       <w:lvlText w:val="o"/>
-      <w:lvlJc w:val="start"/>
+      <w:lvlJc w:val="left"/>
       <w:pPr>
         <w:tabs>
           <w:tab w:val="num" w:pos="5310"/>
         </w:tabs>
-        <w:ind w:start="5310" w:hanging="360"/>
+        <w:ind w:left="5310" w:hanging="360"/>
       </w:pPr>
       <w:rPr>
         <w:rFonts w:ascii="Courier New" w:hAnsi="Courier New" w:cs="Courier New" w:hint="default"/>
@@ -2139,113 +1887,568 @@
       <w:start w:val="1"/>
       <w:numFmt w:val="bullet"/>
       <w:lvlText w:val=""/>
-      <w:lvlJc w:val="start"/>
+      <w:lvlJc w:val="left"/>
       <w:pPr>
         <w:tabs>
           <w:tab w:val="num" w:pos="6030"/>
         </w:tabs>
-        <w:ind w:start="6030" w:hanging="360"/>
+        <w:ind w:left="6030" w:hanging="360"/>
       </w:pPr>
       <w:rPr>
         <w:rFonts w:ascii="Wingdings" w:hAnsi="Wingdings" w:cs="Wingdings" w:hint="default"/>
       </w:rPr>
     </w:lvl>
   </w:abstractNum>
-  <w:abstractNum w:abstractNumId="3">
+  <w:abstractNum w:abstractNumId="2" w15:restartNumberingAfterBreak="0">
+    <w:nsid w:val="5D530CC0"/>
+    <w:multiLevelType w:val="multilevel"/>
+    <w:tmpl w:val="CD4A2D52"/>
     <w:lvl w:ilvl="0">
       <w:start w:val="1"/>
       <w:numFmt w:val="bullet"/>
       <w:lvlText w:val=""/>
-      <w:lvlJc w:val="start"/>
+      <w:lvlJc w:val="left"/>
       <w:pPr>
         <w:tabs>
           <w:tab w:val="num" w:pos="1440"/>
         </w:tabs>
-        <w:ind w:start="1440" w:hanging="360"/>
+        <w:ind w:left="1440" w:hanging="360"/>
       </w:pPr>
       <w:rPr>
         <w:rFonts w:ascii="Wingdings" w:hAnsi="Wingdings" w:cs="Wingdings" w:hint="default"/>
       </w:rPr>
     </w:lvl>
+    <w:lvl w:ilvl="1">
+      <w:numFmt w:val="decimal"/>
+      <w:lvlText w:val=""/>
+      <w:lvlJc w:val="left"/>
+    </w:lvl>
+    <w:lvl w:ilvl="2">
+      <w:numFmt w:val="decimal"/>
+      <w:lvlText w:val=""/>
+      <w:lvlJc w:val="left"/>
+    </w:lvl>
+    <w:lvl w:ilvl="3">
+      <w:numFmt w:val="decimal"/>
+      <w:lvlText w:val=""/>
+      <w:lvlJc w:val="left"/>
+    </w:lvl>
+    <w:lvl w:ilvl="4">
+      <w:numFmt w:val="decimal"/>
+      <w:lvlText w:val=""/>
+      <w:lvlJc w:val="left"/>
+    </w:lvl>
+    <w:lvl w:ilvl="5">
+      <w:numFmt w:val="decimal"/>
+      <w:lvlText w:val=""/>
+      <w:lvlJc w:val="left"/>
+    </w:lvl>
+    <w:lvl w:ilvl="6">
+      <w:numFmt w:val="decimal"/>
+      <w:lvlText w:val=""/>
+      <w:lvlJc w:val="left"/>
+    </w:lvl>
+    <w:lvl w:ilvl="7">
+      <w:numFmt w:val="decimal"/>
+      <w:lvlText w:val=""/>
+      <w:lvlJc w:val="left"/>
+    </w:lvl>
+    <w:lvl w:ilvl="8">
+      <w:numFmt w:val="decimal"/>
+      <w:lvlText w:val=""/>
+      <w:lvlJc w:val="left"/>
+    </w:lvl>
   </w:abstractNum>
-  <w:abstractNum w:abstractNumId="4">
+  <w:abstractNum w:abstractNumId="3" w15:restartNumberingAfterBreak="0">
+    <w:nsid w:val="7918538A"/>
+    <w:multiLevelType w:val="multilevel"/>
+    <w:tmpl w:val="5C049E04"/>
     <w:lvl w:ilvl="0">
       <w:start w:val="1"/>
       <w:numFmt w:val="decimal"/>
       <w:lvlText w:val="%1."/>
-      <w:lvlJc w:val="start"/>
+      <w:lvlJc w:val="left"/>
       <w:pPr>
         <w:tabs>
           <w:tab w:val="num" w:pos="0"/>
         </w:tabs>
-        <w:ind w:start="720" w:hanging="360"/>
-      </w:pPr>
-      <w:rPr/>
+        <w:ind w:left="720" w:hanging="360"/>
+      </w:pPr>
+    </w:lvl>
+    <w:lvl w:ilvl="1">
+      <w:numFmt w:val="decimal"/>
+      <w:lvlText w:val=""/>
+      <w:lvlJc w:val="left"/>
+    </w:lvl>
+    <w:lvl w:ilvl="2">
+      <w:numFmt w:val="decimal"/>
+      <w:lvlText w:val=""/>
+      <w:lvlJc w:val="left"/>
+    </w:lvl>
+    <w:lvl w:ilvl="3">
+      <w:numFmt w:val="decimal"/>
+      <w:lvlText w:val=""/>
+      <w:lvlJc w:val="left"/>
+    </w:lvl>
+    <w:lvl w:ilvl="4">
+      <w:numFmt w:val="decimal"/>
+      <w:lvlText w:val=""/>
+      <w:lvlJc w:val="left"/>
+    </w:lvl>
+    <w:lvl w:ilvl="5">
+      <w:numFmt w:val="decimal"/>
+      <w:lvlText w:val=""/>
+      <w:lvlJc w:val="left"/>
+    </w:lvl>
+    <w:lvl w:ilvl="6">
+      <w:numFmt w:val="decimal"/>
+      <w:lvlText w:val=""/>
+      <w:lvlJc w:val="left"/>
+    </w:lvl>
+    <w:lvl w:ilvl="7">
+      <w:numFmt w:val="decimal"/>
+      <w:lvlText w:val=""/>
+      <w:lvlJc w:val="left"/>
+    </w:lvl>
+    <w:lvl w:ilvl="8">
+      <w:numFmt w:val="decimal"/>
+      <w:lvlText w:val=""/>
+      <w:lvlJc w:val="left"/>
     </w:lvl>
   </w:abstractNum>
-  <w:num w:numId="1">
+  <w:num w:numId="1" w16cid:durableId="146020923">
+    <w:abstractNumId w:val="0"/>
+  </w:num>
+  <w:num w:numId="2" w16cid:durableId="210970076">
     <w:abstractNumId w:val="1"/>
   </w:num>
-  <w:num w:numId="2">
+  <w:num w:numId="3" w16cid:durableId="1020665068">
     <w:abstractNumId w:val="2"/>
   </w:num>
-  <w:num w:numId="3">
+  <w:num w:numId="4" w16cid:durableId="313487337">
     <w:abstractNumId w:val="3"/>
-  </w:num>
-  <w:num w:numId="4">
-    <w:abstractNumId w:val="4"/>
   </w:num>
 </w:numbering>
 </file>
 
 <file path=word/styles.xml><?xml version="1.0" encoding="utf-8"?>
-<w:styles xmlns:w="http://schemas.openxmlformats.org/wordprocessingml/2006/main" xmlns:w14="http://schemas.microsoft.com/office/word/2010/wordml" xmlns:mc="http://schemas.openxmlformats.org/markup-compatibility/2006" mc:Ignorable="w14">
+<w:styles xmlns:mc="http://schemas.openxmlformats.org/markup-compatibility/2006" xmlns:r="http://schemas.openxmlformats.org/officeDocument/2006/relationships" xmlns:w="http://schemas.openxmlformats.org/wordprocessingml/2006/main" xmlns:w14="http://schemas.microsoft.com/office/word/2010/wordml" xmlns:w15="http://schemas.microsoft.com/office/word/2012/wordml" xmlns:w16cex="http://schemas.microsoft.com/office/word/2018/wordml/cex" xmlns:w16cid="http://schemas.microsoft.com/office/word/2016/wordml/cid" xmlns:w16="http://schemas.microsoft.com/office/word/2018/wordml" xmlns:w16du="http://schemas.microsoft.com/office/word/2023/wordml/word16du" xmlns:w16sdtdh="http://schemas.microsoft.com/office/word/2020/wordml/sdtdatahash" xmlns:w16sdtfl="http://schemas.microsoft.com/office/word/2024/wordml/sdtformatlock" xmlns:w16se="http://schemas.microsoft.com/office/word/2015/wordml/symex" mc:Ignorable="w14 w15 w16se w16cid w16 w16cex w16sdtdh w16sdtfl w16du">
   <w:docDefaults>
     <w:rPrDefault>
       <w:rPr>
-        <w:rFonts w:ascii="Liberation Serif" w:hAnsi="Liberation Serif" w:eastAsia="NSimSun" w:cs="Lucida Sans"/>
-        <w:sz w:val="24"/>
-        <w:szCs w:val="24"/>
-        <w:lang w:val="en-US" w:eastAsia="zh-CN" w:bidi="hi-IN"/>
+        <w:rFonts w:ascii="Liberation Serif" w:eastAsia="NSimSun" w:hAnsi="Liberation Serif" w:cs="Lucida Sans"/>
+        <w:lang w:val="vi-VN" w:eastAsia="vi-VN" w:bidi="ar-SA"/>
       </w:rPr>
     </w:rPrDefault>
-    <w:pPrDefault>
-      <w:pPr>
-        <w:suppressAutoHyphens w:val="true"/>
-      </w:pPr>
-    </w:pPrDefault>
+    <w:pPrDefault/>
   </w:docDefaults>
-  <w:style w:type="paragraph" w:styleId="Normal">
+  <w:latentStyles w:defLockedState="0" w:defUIPriority="99" w:defSemiHidden="0" w:defUnhideWhenUsed="0" w:defQFormat="0" w:count="376">
+    <w:lsdException w:name="Normal" w:uiPriority="0" w:qFormat="1"/>
+    <w:lsdException w:name="heading 1" w:uiPriority="9" w:qFormat="1"/>
+    <w:lsdException w:name="heading 2" w:semiHidden="1" w:uiPriority="9" w:unhideWhenUsed="1" w:qFormat="1"/>
+    <w:lsdException w:name="heading 3" w:semiHidden="1" w:uiPriority="9" w:unhideWhenUsed="1" w:qFormat="1"/>
+    <w:lsdException w:name="heading 4" w:semiHidden="1" w:uiPriority="9" w:unhideWhenUsed="1" w:qFormat="1"/>
+    <w:lsdException w:name="heading 5" w:semiHidden="1" w:uiPriority="9" w:unhideWhenUsed="1" w:qFormat="1"/>
+    <w:lsdException w:name="heading 6" w:semiHidden="1" w:uiPriority="9" w:unhideWhenUsed="1" w:qFormat="1"/>
+    <w:lsdException w:name="heading 7" w:semiHidden="1" w:uiPriority="9" w:unhideWhenUsed="1" w:qFormat="1"/>
+    <w:lsdException w:name="heading 8" w:semiHidden="1" w:uiPriority="9" w:unhideWhenUsed="1" w:qFormat="1"/>
+    <w:lsdException w:name="heading 9" w:semiHidden="1" w:uiPriority="9" w:unhideWhenUsed="1" w:qFormat="1"/>
+    <w:lsdException w:name="index 1" w:semiHidden="1" w:unhideWhenUsed="1"/>
+    <w:lsdException w:name="index 2" w:semiHidden="1" w:unhideWhenUsed="1"/>
+    <w:lsdException w:name="index 3" w:semiHidden="1" w:unhideWhenUsed="1"/>
+    <w:lsdException w:name="index 4" w:semiHidden="1" w:unhideWhenUsed="1"/>
+    <w:lsdException w:name="index 5" w:semiHidden="1" w:unhideWhenUsed="1"/>
+    <w:lsdException w:name="index 6" w:semiHidden="1" w:unhideWhenUsed="1"/>
+    <w:lsdException w:name="index 7" w:semiHidden="1" w:unhideWhenUsed="1"/>
+    <w:lsdException w:name="index 8" w:semiHidden="1" w:unhideWhenUsed="1"/>
+    <w:lsdException w:name="index 9" w:semiHidden="1" w:unhideWhenUsed="1"/>
+    <w:lsdException w:name="toc 1" w:semiHidden="1" w:uiPriority="39" w:unhideWhenUsed="1"/>
+    <w:lsdException w:name="toc 2" w:semiHidden="1" w:uiPriority="39" w:unhideWhenUsed="1"/>
+    <w:lsdException w:name="toc 3" w:semiHidden="1" w:uiPriority="39" w:unhideWhenUsed="1"/>
+    <w:lsdException w:name="toc 4" w:semiHidden="1" w:uiPriority="39" w:unhideWhenUsed="1"/>
+    <w:lsdException w:name="toc 5" w:semiHidden="1" w:uiPriority="39" w:unhideWhenUsed="1"/>
+    <w:lsdException w:name="toc 6" w:semiHidden="1" w:uiPriority="39" w:unhideWhenUsed="1"/>
+    <w:lsdException w:name="toc 7" w:semiHidden="1" w:uiPriority="39" w:unhideWhenUsed="1"/>
+    <w:lsdException w:name="toc 8" w:semiHidden="1" w:uiPriority="39" w:unhideWhenUsed="1"/>
+    <w:lsdException w:name="toc 9" w:semiHidden="1" w:uiPriority="39" w:unhideWhenUsed="1"/>
+    <w:lsdException w:name="Normal Indent" w:semiHidden="1" w:unhideWhenUsed="1"/>
+    <w:lsdException w:name="footnote text" w:semiHidden="1" w:unhideWhenUsed="1"/>
+    <w:lsdException w:name="annotation text" w:semiHidden="1" w:unhideWhenUsed="1"/>
+    <w:lsdException w:name="header" w:semiHidden="1" w:unhideWhenUsed="1"/>
+    <w:lsdException w:name="footer" w:semiHidden="1" w:unhideWhenUsed="1"/>
+    <w:lsdException w:name="index heading" w:semiHidden="1" w:unhideWhenUsed="1"/>
+    <w:lsdException w:name="caption" w:semiHidden="1" w:uiPriority="35" w:unhideWhenUsed="1" w:qFormat="1"/>
+    <w:lsdException w:name="table of figures" w:semiHidden="1" w:unhideWhenUsed="1"/>
+    <w:lsdException w:name="envelope address" w:semiHidden="1" w:unhideWhenUsed="1"/>
+    <w:lsdException w:name="envelope return" w:semiHidden="1" w:unhideWhenUsed="1"/>
+    <w:lsdException w:name="footnote reference" w:semiHidden="1" w:unhideWhenUsed="1"/>
+    <w:lsdException w:name="annotation reference" w:semiHidden="1" w:unhideWhenUsed="1"/>
+    <w:lsdException w:name="line number" w:semiHidden="1" w:unhideWhenUsed="1"/>
+    <w:lsdException w:name="page number" w:semiHidden="1" w:unhideWhenUsed="1"/>
+    <w:lsdException w:name="endnote reference" w:semiHidden="1" w:unhideWhenUsed="1"/>
+    <w:lsdException w:name="endnote text" w:semiHidden="1" w:unhideWhenUsed="1"/>
+    <w:lsdException w:name="table of authorities" w:semiHidden="1" w:unhideWhenUsed="1"/>
+    <w:lsdException w:name="macro" w:semiHidden="1" w:unhideWhenUsed="1"/>
+    <w:lsdException w:name="toa heading" w:semiHidden="1" w:unhideWhenUsed="1"/>
+    <w:lsdException w:name="List" w:semiHidden="1" w:unhideWhenUsed="1"/>
+    <w:lsdException w:name="List Bullet" w:semiHidden="1" w:unhideWhenUsed="1"/>
+    <w:lsdException w:name="List Number" w:semiHidden="1" w:unhideWhenUsed="1"/>
+    <w:lsdException w:name="List 2" w:semiHidden="1" w:unhideWhenUsed="1"/>
+    <w:lsdException w:name="List 3" w:semiHidden="1" w:unhideWhenUsed="1"/>
+    <w:lsdException w:name="List 4" w:semiHidden="1" w:unhideWhenUsed="1"/>
+    <w:lsdException w:name="List 5" w:semiHidden="1" w:unhideWhenUsed="1"/>
+    <w:lsdException w:name="List Bullet 2" w:semiHidden="1" w:unhideWhenUsed="1"/>
+    <w:lsdException w:name="List Bullet 3" w:semiHidden="1" w:unhideWhenUsed="1"/>
+    <w:lsdException w:name="List Bullet 4" w:semiHidden="1" w:unhideWhenUsed="1"/>
+    <w:lsdException w:name="List Bullet 5" w:semiHidden="1" w:unhideWhenUsed="1"/>
+    <w:lsdException w:name="List Number 2" w:semiHidden="1" w:unhideWhenUsed="1"/>
+    <w:lsdException w:name="List Number 3" w:semiHidden="1" w:unhideWhenUsed="1"/>
+    <w:lsdException w:name="List Number 4" w:semiHidden="1" w:unhideWhenUsed="1"/>
+    <w:lsdException w:name="List Number 5" w:semiHidden="1" w:unhideWhenUsed="1"/>
+    <w:lsdException w:name="Title" w:uiPriority="10" w:qFormat="1"/>
+    <w:lsdException w:name="Closing" w:semiHidden="1" w:unhideWhenUsed="1"/>
+    <w:lsdException w:name="Signature" w:semiHidden="1" w:unhideWhenUsed="1"/>
+    <w:lsdException w:name="Default Paragraph Font" w:semiHidden="1" w:uiPriority="1" w:unhideWhenUsed="1"/>
+    <w:lsdException w:name="Body Text" w:semiHidden="1" w:unhideWhenUsed="1"/>
+    <w:lsdException w:name="Body Text Indent" w:semiHidden="1" w:unhideWhenUsed="1"/>
+    <w:lsdException w:name="List Continue" w:semiHidden="1" w:unhideWhenUsed="1"/>
+    <w:lsdException w:name="List Continue 2" w:semiHidden="1" w:unhideWhenUsed="1"/>
+    <w:lsdException w:name="List Continue 3" w:semiHidden="1" w:unhideWhenUsed="1"/>
+    <w:lsdException w:name="List Continue 4" w:semiHidden="1" w:unhideWhenUsed="1"/>
+    <w:lsdException w:name="List Continue 5" w:semiHidden="1" w:unhideWhenUsed="1"/>
+    <w:lsdException w:name="Message Header" w:semiHidden="1" w:unhideWhenUsed="1"/>
+    <w:lsdException w:name="Subtitle" w:uiPriority="11" w:qFormat="1"/>
+    <w:lsdException w:name="Salutation" w:semiHidden="1" w:unhideWhenUsed="1"/>
+    <w:lsdException w:name="Date" w:semiHidden="1" w:unhideWhenUsed="1"/>
+    <w:lsdException w:name="Body Text First Indent" w:semiHidden="1" w:unhideWhenUsed="1"/>
+    <w:lsdException w:name="Body Text First Indent 2" w:semiHidden="1" w:unhideWhenUsed="1"/>
+    <w:lsdException w:name="Note Heading" w:semiHidden="1" w:unhideWhenUsed="1"/>
+    <w:lsdException w:name="Body Text 2" w:semiHidden="1" w:unhideWhenUsed="1"/>
+    <w:lsdException w:name="Body Text 3" w:semiHidden="1" w:unhideWhenUsed="1"/>
+    <w:lsdException w:name="Body Text Indent 2" w:semiHidden="1" w:unhideWhenUsed="1"/>
+    <w:lsdException w:name="Body Text Indent 3" w:semiHidden="1" w:unhideWhenUsed="1"/>
+    <w:lsdException w:name="Block Text" w:semiHidden="1" w:unhideWhenUsed="1"/>
+    <w:lsdException w:name="Hyperlink" w:semiHidden="1" w:unhideWhenUsed="1"/>
+    <w:lsdException w:name="FollowedHyperlink" w:semiHidden="1" w:unhideWhenUsed="1"/>
+    <w:lsdException w:name="Strong" w:uiPriority="22" w:qFormat="1"/>
+    <w:lsdException w:name="Emphasis" w:uiPriority="20" w:qFormat="1"/>
+    <w:lsdException w:name="Document Map" w:semiHidden="1" w:unhideWhenUsed="1"/>
+    <w:lsdException w:name="Plain Text" w:semiHidden="1" w:unhideWhenUsed="1"/>
+    <w:lsdException w:name="E-mail Signature" w:semiHidden="1" w:unhideWhenUsed="1"/>
+    <w:lsdException w:name="HTML Top of Form" w:semiHidden="1" w:unhideWhenUsed="1"/>
+    <w:lsdException w:name="HTML Bottom of Form" w:semiHidden="1" w:unhideWhenUsed="1"/>
+    <w:lsdException w:name="Normal (Web)" w:semiHidden="1" w:unhideWhenUsed="1"/>
+    <w:lsdException w:name="HTML Acronym" w:semiHidden="1" w:unhideWhenUsed="1"/>
+    <w:lsdException w:name="HTML Address" w:semiHidden="1" w:unhideWhenUsed="1"/>
+    <w:lsdException w:name="HTML Cite" w:semiHidden="1" w:unhideWhenUsed="1"/>
+    <w:lsdException w:name="HTML Code" w:semiHidden="1" w:unhideWhenUsed="1"/>
+    <w:lsdException w:name="HTML Definition" w:semiHidden="1" w:unhideWhenUsed="1"/>
+    <w:lsdException w:name="HTML Keyboard" w:semiHidden="1" w:unhideWhenUsed="1"/>
+    <w:lsdException w:name="HTML Preformatted" w:semiHidden="1" w:unhideWhenUsed="1"/>
+    <w:lsdException w:name="HTML Sample" w:semiHidden="1" w:unhideWhenUsed="1"/>
+    <w:lsdException w:name="HTML Typewriter" w:semiHidden="1" w:unhideWhenUsed="1"/>
+    <w:lsdException w:name="HTML Variable" w:semiHidden="1" w:unhideWhenUsed="1"/>
+    <w:lsdException w:name="Normal Table" w:semiHidden="1" w:unhideWhenUsed="1"/>
+    <w:lsdException w:name="annotation subject" w:semiHidden="1" w:unhideWhenUsed="1"/>
+    <w:lsdException w:name="No List" w:semiHidden="1" w:unhideWhenUsed="1"/>
+    <w:lsdException w:name="Outline List 1" w:semiHidden="1" w:unhideWhenUsed="1"/>
+    <w:lsdException w:name="Outline List 2" w:semiHidden="1" w:unhideWhenUsed="1"/>
+    <w:lsdException w:name="Outline List 3" w:semiHidden="1" w:unhideWhenUsed="1"/>
+    <w:lsdException w:name="Table Simple 1" w:semiHidden="1" w:unhideWhenUsed="1"/>
+    <w:lsdException w:name="Table Simple 2" w:semiHidden="1" w:unhideWhenUsed="1"/>
+    <w:lsdException w:name="Table Simple 3" w:semiHidden="1" w:unhideWhenUsed="1"/>
+    <w:lsdException w:name="Table Classic 1" w:semiHidden="1" w:unhideWhenUsed="1"/>
+    <w:lsdException w:name="Table Classic 2" w:semiHidden="1" w:unhideWhenUsed="1"/>
+    <w:lsdException w:name="Table Classic 3" w:semiHidden="1" w:unhideWhenUsed="1"/>
+    <w:lsdException w:name="Table Classic 4" w:semiHidden="1" w:unhideWhenUsed="1"/>
+    <w:lsdException w:name="Table Colorful 1" w:semiHidden="1" w:unhideWhenUsed="1"/>
+    <w:lsdException w:name="Table Colorful 2" w:semiHidden="1" w:unhideWhenUsed="1"/>
+    <w:lsdException w:name="Table Colorful 3" w:semiHidden="1" w:unhideWhenUsed="1"/>
+    <w:lsdException w:name="Table Columns 1" w:semiHidden="1" w:unhideWhenUsed="1"/>
+    <w:lsdException w:name="Table Columns 2" w:semiHidden="1" w:unhideWhenUsed="1"/>
+    <w:lsdException w:name="Table Columns 3" w:semiHidden="1" w:unhideWhenUsed="1"/>
+    <w:lsdException w:name="Table Columns 4" w:semiHidden="1" w:unhideWhenUsed="1"/>
+    <w:lsdException w:name="Table Columns 5" w:semiHidden="1" w:unhideWhenUsed="1"/>
+    <w:lsdException w:name="Table Grid 1" w:semiHidden="1" w:unhideWhenUsed="1"/>
+    <w:lsdException w:name="Table Grid 2" w:semiHidden="1" w:unhideWhenUsed="1"/>
+    <w:lsdException w:name="Table Grid 3" w:semiHidden="1" w:unhideWhenUsed="1"/>
+    <w:lsdException w:name="Table Grid 4" w:semiHidden="1" w:unhideWhenUsed="1"/>
+    <w:lsdException w:name="Table Grid 5" w:semiHidden="1" w:unhideWhenUsed="1"/>
+    <w:lsdException w:name="Table Grid 6" w:semiHidden="1" w:unhideWhenUsed="1"/>
+    <w:lsdException w:name="Table Grid 7" w:semiHidden="1" w:unhideWhenUsed="1"/>
+    <w:lsdException w:name="Table Grid 8" w:semiHidden="1" w:unhideWhenUsed="1"/>
+    <w:lsdException w:name="Table List 1" w:semiHidden="1" w:unhideWhenUsed="1"/>
+    <w:lsdException w:name="Table List 2" w:semiHidden="1" w:unhideWhenUsed="1"/>
+    <w:lsdException w:name="Table List 3" w:semiHidden="1" w:unhideWhenUsed="1"/>
+    <w:lsdException w:name="Table List 4" w:semiHidden="1" w:unhideWhenUsed="1"/>
+    <w:lsdException w:name="Table List 5" w:semiHidden="1" w:unhideWhenUsed="1"/>
+    <w:lsdException w:name="Table List 6" w:semiHidden="1" w:unhideWhenUsed="1"/>
+    <w:lsdException w:name="Table List 7" w:semiHidden="1" w:unhideWhenUsed="1"/>
+    <w:lsdException w:name="Table List 8" w:semiHidden="1" w:unhideWhenUsed="1"/>
+    <w:lsdException w:name="Table 3D effects 1" w:semiHidden="1" w:unhideWhenUsed="1"/>
+    <w:lsdException w:name="Table 3D effects 2" w:semiHidden="1" w:unhideWhenUsed="1"/>
+    <w:lsdException w:name="Table 3D effects 3" w:semiHidden="1" w:unhideWhenUsed="1"/>
+    <w:lsdException w:name="Table Contemporary" w:semiHidden="1" w:unhideWhenUsed="1"/>
+    <w:lsdException w:name="Table Elegant" w:semiHidden="1" w:unhideWhenUsed="1"/>
+    <w:lsdException w:name="Table Professional" w:semiHidden="1" w:unhideWhenUsed="1"/>
+    <w:lsdException w:name="Table Subtle 1" w:semiHidden="1" w:unhideWhenUsed="1"/>
+    <w:lsdException w:name="Table Subtle 2" w:semiHidden="1" w:unhideWhenUsed="1"/>
+    <w:lsdException w:name="Table Web 1" w:semiHidden="1" w:unhideWhenUsed="1"/>
+    <w:lsdException w:name="Table Web 2" w:semiHidden="1" w:unhideWhenUsed="1"/>
+    <w:lsdException w:name="Table Web 3" w:semiHidden="1" w:unhideWhenUsed="1"/>
+    <w:lsdException w:name="Balloon Text" w:semiHidden="1" w:unhideWhenUsed="1"/>
+    <w:lsdException w:name="Table Grid" w:uiPriority="39"/>
+    <w:lsdException w:name="Table Theme" w:semiHidden="1" w:unhideWhenUsed="1"/>
+    <w:lsdException w:name="Placeholder Text" w:semiHidden="1"/>
+    <w:lsdException w:name="No Spacing" w:uiPriority="1" w:qFormat="1"/>
+    <w:lsdException w:name="Light Shading" w:uiPriority="60"/>
+    <w:lsdException w:name="Light List" w:uiPriority="61"/>
+    <w:lsdException w:name="Light Grid" w:uiPriority="62"/>
+    <w:lsdException w:name="Medium Shading 1" w:uiPriority="63"/>
+    <w:lsdException w:name="Medium Shading 2" w:uiPriority="64"/>
+    <w:lsdException w:name="Medium List 1" w:uiPriority="65"/>
+    <w:lsdException w:name="Medium List 2" w:uiPriority="66"/>
+    <w:lsdException w:name="Medium Grid 1" w:uiPriority="67"/>
+    <w:lsdException w:name="Medium Grid 2" w:uiPriority="68"/>
+    <w:lsdException w:name="Medium Grid 3" w:uiPriority="69"/>
+    <w:lsdException w:name="Dark List" w:uiPriority="70"/>
+    <w:lsdException w:name="Colorful Shading" w:uiPriority="71"/>
+    <w:lsdException w:name="Colorful List" w:uiPriority="72"/>
+    <w:lsdException w:name="Colorful Grid" w:uiPriority="73"/>
+    <w:lsdException w:name="Light Shading Accent 1" w:uiPriority="60"/>
+    <w:lsdException w:name="Light List Accent 1" w:uiPriority="61"/>
+    <w:lsdException w:name="Light Grid Accent 1" w:uiPriority="62"/>
+    <w:lsdException w:name="Medium Shading 1 Accent 1" w:uiPriority="63"/>
+    <w:lsdException w:name="Medium Shading 2 Accent 1" w:uiPriority="64"/>
+    <w:lsdException w:name="Medium List 1 Accent 1" w:uiPriority="65"/>
+    <w:lsdException w:name="Revision" w:semiHidden="1"/>
+    <w:lsdException w:name="List Paragraph" w:uiPriority="34" w:qFormat="1"/>
+    <w:lsdException w:name="Quote" w:uiPriority="29" w:qFormat="1"/>
+    <w:lsdException w:name="Intense Quote" w:uiPriority="30" w:qFormat="1"/>
+    <w:lsdException w:name="Medium List 2 Accent 1" w:uiPriority="66"/>
+    <w:lsdException w:name="Medium Grid 1 Accent 1" w:uiPriority="67"/>
+    <w:lsdException w:name="Medium Grid 2 Accent 1" w:uiPriority="68"/>
+    <w:lsdException w:name="Medium Grid 3 Accent 1" w:uiPriority="69"/>
+    <w:lsdException w:name="Dark List Accent 1" w:uiPriority="70"/>
+    <w:lsdException w:name="Colorful Shading Accent 1" w:uiPriority="71"/>
+    <w:lsdException w:name="Colorful List Accent 1" w:uiPriority="72"/>
+    <w:lsdException w:name="Colorful Grid Accent 1" w:uiPriority="73"/>
+    <w:lsdException w:name="Light Shading Accent 2" w:uiPriority="60"/>
+    <w:lsdException w:name="Light List Accent 2" w:uiPriority="61"/>
+    <w:lsdException w:name="Light Grid Accent 2" w:uiPriority="62"/>
+    <w:lsdException w:name="Medium Shading 1 Accent 2" w:uiPriority="63"/>
+    <w:lsdException w:name="Medium Shading 2 Accent 2" w:uiPriority="64"/>
+    <w:lsdException w:name="Medium List 1 Accent 2" w:uiPriority="65"/>
+    <w:lsdException w:name="Medium List 2 Accent 2" w:uiPriority="66"/>
+    <w:lsdException w:name="Medium Grid 1 Accent 2" w:uiPriority="67"/>
+    <w:lsdException w:name="Medium Grid 2 Accent 2" w:uiPriority="68"/>
+    <w:lsdException w:name="Medium Grid 3 Accent 2" w:uiPriority="69"/>
+    <w:lsdException w:name="Dark List Accent 2" w:uiPriority="70"/>
+    <w:lsdException w:name="Colorful Shading Accent 2" w:uiPriority="71"/>
+    <w:lsdException w:name="Colorful List Accent 2" w:uiPriority="72"/>
+    <w:lsdException w:name="Colorful Grid Accent 2" w:uiPriority="73"/>
+    <w:lsdException w:name="Light Shading Accent 3" w:uiPriority="60"/>
+    <w:lsdException w:name="Light List Accent 3" w:uiPriority="61"/>
+    <w:lsdException w:name="Light Grid Accent 3" w:uiPriority="62"/>
+    <w:lsdException w:name="Medium Shading 1 Accent 3" w:uiPriority="63"/>
+    <w:lsdException w:name="Medium Shading 2 Accent 3" w:uiPriority="64"/>
+    <w:lsdException w:name="Medium List 1 Accent 3" w:uiPriority="65"/>
+    <w:lsdException w:name="Medium List 2 Accent 3" w:uiPriority="66"/>
+    <w:lsdException w:name="Medium Grid 1 Accent 3" w:uiPriority="67"/>
+    <w:lsdException w:name="Medium Grid 2 Accent 3" w:uiPriority="68"/>
+    <w:lsdException w:name="Medium Grid 3 Accent 3" w:uiPriority="69"/>
+    <w:lsdException w:name="Dark List Accent 3" w:uiPriority="70"/>
+    <w:lsdException w:name="Colorful Shading Accent 3" w:uiPriority="71"/>
+    <w:lsdException w:name="Colorful List Accent 3" w:uiPriority="72"/>
+    <w:lsdException w:name="Colorful Grid Accent 3" w:uiPriority="73"/>
+    <w:lsdException w:name="Light Shading Accent 4" w:uiPriority="60"/>
+    <w:lsdException w:name="Light List Accent 4" w:uiPriority="61"/>
+    <w:lsdException w:name="Light Grid Accent 4" w:uiPriority="62"/>
+    <w:lsdException w:name="Medium Shading 1 Accent 4" w:uiPriority="63"/>
+    <w:lsdException w:name="Medium Shading 2 Accent 4" w:uiPriority="64"/>
+    <w:lsdException w:name="Medium List 1 Accent 4" w:uiPriority="65"/>
+    <w:lsdException w:name="Medium List 2 Accent 4" w:uiPriority="66"/>
+    <w:lsdException w:name="Medium Grid 1 Accent 4" w:uiPriority="67"/>
+    <w:lsdException w:name="Medium Grid 2 Accent 4" w:uiPriority="68"/>
+    <w:lsdException w:name="Medium Grid 3 Accent 4" w:uiPriority="69"/>
+    <w:lsdException w:name="Dark List Accent 4" w:uiPriority="70"/>
+    <w:lsdException w:name="Colorful Shading Accent 4" w:uiPriority="71"/>
+    <w:lsdException w:name="Colorful List Accent 4" w:uiPriority="72"/>
+    <w:lsdException w:name="Colorful Grid Accent 4" w:uiPriority="73"/>
+    <w:lsdException w:name="Light Shading Accent 5" w:uiPriority="60"/>
+    <w:lsdException w:name="Light List Accent 5" w:uiPriority="61"/>
+    <w:lsdException w:name="Light Grid Accent 5" w:uiPriority="62"/>
+    <w:lsdException w:name="Medium Shading 1 Accent 5" w:uiPriority="63"/>
+    <w:lsdException w:name="Medium Shading 2 Accent 5" w:uiPriority="64"/>
+    <w:lsdException w:name="Medium List 1 Accent 5" w:uiPriority="65"/>
+    <w:lsdException w:name="Medium List 2 Accent 5" w:uiPriority="66"/>
+    <w:lsdException w:name="Medium Grid 1 Accent 5" w:uiPriority="67"/>
+    <w:lsdException w:name="Medium Grid 2 Accent 5" w:uiPriority="68"/>
+    <w:lsdException w:name="Medium Grid 3 Accent 5" w:uiPriority="69"/>
+    <w:lsdException w:name="Dark List Accent 5" w:uiPriority="70"/>
+    <w:lsdException w:name="Colorful Shading Accent 5" w:uiPriority="71"/>
+    <w:lsdException w:name="Colorful List Accent 5" w:uiPriority="72"/>
+    <w:lsdException w:name="Colorful Grid Accent 5" w:uiPriority="73"/>
+    <w:lsdException w:name="Light Shading Accent 6" w:uiPriority="60"/>
+    <w:lsdException w:name="Light List Accent 6" w:uiPriority="61"/>
+    <w:lsdException w:name="Light Grid Accent 6" w:uiPriority="62"/>
+    <w:lsdException w:name="Medium Shading 1 Accent 6" w:uiPriority="63"/>
+    <w:lsdException w:name="Medium Shading 2 Accent 6" w:uiPriority="64"/>
+    <w:lsdException w:name="Medium List 1 Accent 6" w:uiPriority="65"/>
+    <w:lsdException w:name="Medium List 2 Accent 6" w:uiPriority="66"/>
+    <w:lsdException w:name="Medium Grid 1 Accent 6" w:uiPriority="67"/>
+    <w:lsdException w:name="Medium Grid 2 Accent 6" w:uiPriority="68"/>
+    <w:lsdException w:name="Medium Grid 3 Accent 6" w:uiPriority="69"/>
+    <w:lsdException w:name="Dark List Accent 6" w:uiPriority="70"/>
+    <w:lsdException w:name="Colorful Shading Accent 6" w:uiPriority="71"/>
+    <w:lsdException w:name="Colorful List Accent 6" w:uiPriority="72"/>
+    <w:lsdException w:name="Colorful Grid Accent 6" w:uiPriority="73"/>
+    <w:lsdException w:name="Subtle Emphasis" w:uiPriority="19" w:qFormat="1"/>
+    <w:lsdException w:name="Intense Emphasis" w:uiPriority="21" w:qFormat="1"/>
+    <w:lsdException w:name="Subtle Reference" w:uiPriority="31" w:qFormat="1"/>
+    <w:lsdException w:name="Intense Reference" w:uiPriority="32" w:qFormat="1"/>
+    <w:lsdException w:name="Book Title" w:uiPriority="33" w:qFormat="1"/>
+    <w:lsdException w:name="Bibliography" w:semiHidden="1" w:uiPriority="37" w:unhideWhenUsed="1"/>
+    <w:lsdException w:name="TOC Heading" w:semiHidden="1" w:uiPriority="39" w:unhideWhenUsed="1" w:qFormat="1"/>
+    <w:lsdException w:name="Plain Table 1" w:uiPriority="41"/>
+    <w:lsdException w:name="Plain Table 2" w:uiPriority="42"/>
+    <w:lsdException w:name="Plain Table 3" w:uiPriority="43"/>
+    <w:lsdException w:name="Plain Table 4" w:uiPriority="44"/>
+    <w:lsdException w:name="Plain Table 5" w:uiPriority="45"/>
+    <w:lsdException w:name="Grid Table Light" w:uiPriority="40"/>
+    <w:lsdException w:name="Grid Table 1 Light" w:uiPriority="46"/>
+    <w:lsdException w:name="Grid Table 2" w:uiPriority="47"/>
+    <w:lsdException w:name="Grid Table 3" w:uiPriority="48"/>
+    <w:lsdException w:name="Grid Table 4" w:uiPriority="49"/>
+    <w:lsdException w:name="Grid Table 5 Dark" w:uiPriority="50"/>
+    <w:lsdException w:name="Grid Table 6 Colorful" w:uiPriority="51"/>
+    <w:lsdException w:name="Grid Table 7 Colorful" w:uiPriority="52"/>
+    <w:lsdException w:name="Grid Table 1 Light Accent 1" w:uiPriority="46"/>
+    <w:lsdException w:name="Grid Table 2 Accent 1" w:uiPriority="47"/>
+    <w:lsdException w:name="Grid Table 3 Accent 1" w:uiPriority="48"/>
+    <w:lsdException w:name="Grid Table 4 Accent 1" w:uiPriority="49"/>
+    <w:lsdException w:name="Grid Table 5 Dark Accent 1" w:uiPriority="50"/>
+    <w:lsdException w:name="Grid Table 6 Colorful Accent 1" w:uiPriority="51"/>
+    <w:lsdException w:name="Grid Table 7 Colorful Accent 1" w:uiPriority="52"/>
+    <w:lsdException w:name="Grid Table 1 Light Accent 2" w:uiPriority="46"/>
+    <w:lsdException w:name="Grid Table 2 Accent 2" w:uiPriority="47"/>
+    <w:lsdException w:name="Grid Table 3 Accent 2" w:uiPriority="48"/>
+    <w:lsdException w:name="Grid Table 4 Accent 2" w:uiPriority="49"/>
+    <w:lsdException w:name="Grid Table 5 Dark Accent 2" w:uiPriority="50"/>
+    <w:lsdException w:name="Grid Table 6 Colorful Accent 2" w:uiPriority="51"/>
+    <w:lsdException w:name="Grid Table 7 Colorful Accent 2" w:uiPriority="52"/>
+    <w:lsdException w:name="Grid Table 1 Light Accent 3" w:uiPriority="46"/>
+    <w:lsdException w:name="Grid Table 2 Accent 3" w:uiPriority="47"/>
+    <w:lsdException w:name="Grid Table 3 Accent 3" w:uiPriority="48"/>
+    <w:lsdException w:name="Grid Table 4 Accent 3" w:uiPriority="49"/>
+    <w:lsdException w:name="Grid Table 5 Dark Accent 3" w:uiPriority="50"/>
+    <w:lsdException w:name="Grid Table 6 Colorful Accent 3" w:uiPriority="51"/>
+    <w:lsdException w:name="Grid Table 7 Colorful Accent 3" w:uiPriority="52"/>
+    <w:lsdException w:name="Grid Table 1 Light Accent 4" w:uiPriority="46"/>
+    <w:lsdException w:name="Grid Table 2 Accent 4" w:uiPriority="47"/>
+    <w:lsdException w:name="Grid Table 3 Accent 4" w:uiPriority="48"/>
+    <w:lsdException w:name="Grid Table 4 Accent 4" w:uiPriority="49"/>
+    <w:lsdException w:name="Grid Table 5 Dark Accent 4" w:uiPriority="50"/>
+    <w:lsdException w:name="Grid Table 6 Colorful Accent 4" w:uiPriority="51"/>
+    <w:lsdException w:name="Grid Table 7 Colorful Accent 4" w:uiPriority="52"/>
+    <w:lsdException w:name="Grid Table 1 Light Accent 5" w:uiPriority="46"/>
+    <w:lsdException w:name="Grid Table 2 Accent 5" w:uiPriority="47"/>
+    <w:lsdException w:name="Grid Table 3 Accent 5" w:uiPriority="48"/>
+    <w:lsdException w:name="Grid Table 4 Accent 5" w:uiPriority="49"/>
+    <w:lsdException w:name="Grid Table 5 Dark Accent 5" w:uiPriority="50"/>
+    <w:lsdException w:name="Grid Table 6 Colorful Accent 5" w:uiPriority="51"/>
+    <w:lsdException w:name="Grid Table 7 Colorful Accent 5" w:uiPriority="52"/>
+    <w:lsdException w:name="Grid Table 1 Light Accent 6" w:uiPriority="46"/>
+    <w:lsdException w:name="Grid Table 2 Accent 6" w:uiPriority="47"/>
+    <w:lsdException w:name="Grid Table 3 Accent 6" w:uiPriority="48"/>
+    <w:lsdException w:name="Grid Table 4 Accent 6" w:uiPriority="49"/>
+    <w:lsdException w:name="Grid Table 5 Dark Accent 6" w:uiPriority="50"/>
+    <w:lsdException w:name="Grid Table 6 Colorful Accent 6" w:uiPriority="51"/>
+    <w:lsdException w:name="Grid Table 7 Colorful Accent 6" w:uiPriority="52"/>
+    <w:lsdException w:name="List Table 1 Light" w:uiPriority="46"/>
+    <w:lsdException w:name="List Table 2" w:uiPriority="47"/>
+    <w:lsdException w:name="List Table 3" w:uiPriority="48"/>
+    <w:lsdException w:name="List Table 4" w:uiPriority="49"/>
+    <w:lsdException w:name="List Table 5 Dark" w:uiPriority="50"/>
+    <w:lsdException w:name="List Table 6 Colorful" w:uiPriority="51"/>
+    <w:lsdException w:name="List Table 7 Colorful" w:uiPriority="52"/>
+    <w:lsdException w:name="List Table 1 Light Accent 1" w:uiPriority="46"/>
+    <w:lsdException w:name="List Table 2 Accent 1" w:uiPriority="47"/>
+    <w:lsdException w:name="List Table 3 Accent 1" w:uiPriority="48"/>
+    <w:lsdException w:name="List Table 4 Accent 1" w:uiPriority="49"/>
+    <w:lsdException w:name="List Table 5 Dark Accent 1" w:uiPriority="50"/>
+    <w:lsdException w:name="List Table 6 Colorful Accent 1" w:uiPriority="51"/>
+    <w:lsdException w:name="List Table 7 Colorful Accent 1" w:uiPriority="52"/>
+    <w:lsdException w:name="List Table 1 Light Accent 2" w:uiPriority="46"/>
+    <w:lsdException w:name="List Table 2 Accent 2" w:uiPriority="47"/>
+    <w:lsdException w:name="List Table 3 Accent 2" w:uiPriority="48"/>
+    <w:lsdException w:name="List Table 4 Accent 2" w:uiPriority="49"/>
+    <w:lsdException w:name="List Table 5 Dark Accent 2" w:uiPriority="50"/>
+    <w:lsdException w:name="List Table 6 Colorful Accent 2" w:uiPriority="51"/>
+    <w:lsdException w:name="List Table 7 Colorful Accent 2" w:uiPriority="52"/>
+    <w:lsdException w:name="List Table 1 Light Accent 3" w:uiPriority="46"/>
+    <w:lsdException w:name="List Table 2 Accent 3" w:uiPriority="47"/>
+    <w:lsdException w:name="List Table 3 Accent 3" w:uiPriority="48"/>
+    <w:lsdException w:name="List Table 4 Accent 3" w:uiPriority="49"/>
+    <w:lsdException w:name="List Table 5 Dark Accent 3" w:uiPriority="50"/>
+    <w:lsdException w:name="List Table 6 Colorful Accent 3" w:uiPriority="51"/>
+    <w:lsdException w:name="List Table 7 Colorful Accent 3" w:uiPriority="52"/>
+    <w:lsdException w:name="List Table 1 Light Accent 4" w:uiPriority="46"/>
+    <w:lsdException w:name="List Table 2 Accent 4" w:uiPriority="47"/>
+    <w:lsdException w:name="List Table 3 Accent 4" w:uiPriority="48"/>
+    <w:lsdException w:name="List Table 4 Accent 4" w:uiPriority="49"/>
+    <w:lsdException w:name="List Table 5 Dark Accent 4" w:uiPriority="50"/>
+    <w:lsdException w:name="List Table 6 Colorful Accent 4" w:uiPriority="51"/>
+    <w:lsdException w:name="List Table 7 Colorful Accent 4" w:uiPriority="52"/>
+    <w:lsdException w:name="List Table 1 Light Accent 5" w:uiPriority="46"/>
+    <w:lsdException w:name="List Table 2 Accent 5" w:uiPriority="47"/>
+    <w:lsdException w:name="List Table 3 Accent 5" w:uiPriority="48"/>
+    <w:lsdException w:name="List Table 4 Accent 5" w:uiPriority="49"/>
+    <w:lsdException w:name="List Table 5 Dark Accent 5" w:uiPriority="50"/>
+    <w:lsdException w:name="List Table 6 Colorful Accent 5" w:uiPriority="51"/>
+    <w:lsdException w:name="List Table 7 Colorful Accent 5" w:uiPriority="52"/>
+    <w:lsdException w:name="List Table 1 Light Accent 6" w:uiPriority="46"/>
+    <w:lsdException w:name="List Table 2 Accent 6" w:uiPriority="47"/>
+    <w:lsdException w:name="List Table 3 Accent 6" w:uiPriority="48"/>
+    <w:lsdException w:name="List Table 4 Accent 6" w:uiPriority="49"/>
+    <w:lsdException w:name="List Table 5 Dark Accent 6" w:uiPriority="50"/>
+    <w:lsdException w:name="List Table 6 Colorful Accent 6" w:uiPriority="51"/>
+    <w:lsdException w:name="List Table 7 Colorful Accent 6" w:uiPriority="52"/>
+    <w:lsdException w:name="Mention" w:semiHidden="1" w:unhideWhenUsed="1"/>
+    <w:lsdException w:name="Smart Hyperlink" w:semiHidden="1" w:unhideWhenUsed="1"/>
+    <w:lsdException w:name="Hashtag" w:semiHidden="1" w:unhideWhenUsed="1"/>
+    <w:lsdException w:name="Unresolved Mention" w:semiHidden="1" w:unhideWhenUsed="1"/>
+    <w:lsdException w:name="Smart Link" w:semiHidden="1" w:unhideWhenUsed="1"/>
+  </w:latentStyles>
+  <w:style w:type="paragraph" w:default="1" w:styleId="Normal">
     <w:name w:val="Normal"/>
     <w:qFormat/>
     <w:pPr>
-      <w:widowControl/>
-      <w:bidi w:val="0"/>
+      <w:suppressAutoHyphens/>
     </w:pPr>
     <w:rPr>
-      <w:rFonts w:ascii="Times New Roman" w:hAnsi="Times New Roman" w:eastAsia="Times New Roman" w:cs="Times New Roman"/>
-      <w:color w:val="auto"/>
+      <w:rFonts w:ascii="Times New Roman" w:eastAsia="Times New Roman" w:hAnsi="Times New Roman" w:cs="Times New Roman"/>
       <w:sz w:val="24"/>
       <w:szCs w:val="24"/>
-      <w:lang w:bidi="ar-SA" w:val="en-US" w:eastAsia="zh-CN"/>
+      <w:lang w:val="en-US" w:eastAsia="zh-CN"/>
     </w:rPr>
   </w:style>
   <w:style w:type="paragraph" w:styleId="Heading1">
     <w:name w:val="heading 1"/>
     <w:basedOn w:val="Normal"/>
     <w:next w:val="Normal"/>
+    <w:uiPriority w:val="9"/>
     <w:qFormat/>
     <w:pPr>
-      <w:keepNext w:val="true"/>
+      <w:keepNext/>
       <w:numPr>
-        <w:ilvl w:val="0"/>
         <w:numId w:val="1"/>
       </w:numPr>
       <w:spacing w:before="240" w:after="60"/>
       <w:outlineLvl w:val="0"/>
     </w:pPr>
     <w:rPr>
-      <w:rFonts w:ascii="Calibri Light" w:hAnsi="Calibri Light" w:eastAsia="Times New Roman" w:cs="Times New Roman"/>
+      <w:rFonts w:ascii="Calibri Light" w:hAnsi="Calibri Light"/>
       <w:b/>
       <w:bCs/>
       <w:kern w:val="2"/>
@@ -2257,14 +2460,16 @@
     <w:name w:val="heading 3"/>
     <w:basedOn w:val="Normal"/>
     <w:next w:val="Normal"/>
+    <w:uiPriority w:val="9"/>
+    <w:semiHidden/>
+    <w:unhideWhenUsed/>
     <w:qFormat/>
     <w:pPr>
-      <w:keepNext w:val="true"/>
+      <w:keepNext/>
       <w:numPr>
         <w:ilvl w:val="2"/>
         <w:numId w:val="1"/>
       </w:numPr>
-      <w:suppressAutoHyphens w:val="true"/>
       <w:spacing w:before="240" w:after="60"/>
       <w:outlineLvl w:val="2"/>
     </w:pPr>
@@ -2276,161 +2481,186 @@
       <w:szCs w:val="26"/>
     </w:rPr>
   </w:style>
-  <w:style w:type="character" w:styleId="WW8Num1z0">
+  <w:style w:type="character" w:default="1" w:styleId="DefaultParagraphFont">
+    <w:name w:val="Default Paragraph Font"/>
+    <w:uiPriority w:val="1"/>
+    <w:semiHidden/>
+    <w:unhideWhenUsed/>
+  </w:style>
+  <w:style w:type="table" w:default="1" w:styleId="TableNormal">
+    <w:name w:val="Normal Table"/>
+    <w:uiPriority w:val="99"/>
+    <w:semiHidden/>
+    <w:unhideWhenUsed/>
+    <w:tblPr>
+      <w:tblInd w:w="0" w:type="dxa"/>
+      <w:tblCellMar>
+        <w:top w:w="0" w:type="dxa"/>
+        <w:left w:w="108" w:type="dxa"/>
+        <w:bottom w:w="0" w:type="dxa"/>
+        <w:right w:w="108" w:type="dxa"/>
+      </w:tblCellMar>
+    </w:tblPr>
+  </w:style>
+  <w:style w:type="numbering" w:default="1" w:styleId="NoList">
+    <w:name w:val="No List"/>
+    <w:uiPriority w:val="99"/>
+    <w:semiHidden/>
+    <w:unhideWhenUsed/>
+  </w:style>
+  <w:style w:type="character" w:customStyle="1" w:styleId="WW8Num1z0">
     <w:name w:val="WW8Num1z0"/>
     <w:qFormat/>
     <w:rPr>
-      <w:rFonts w:ascii="Times New Roman" w:hAnsi="Times New Roman" w:eastAsia="Times New Roman" w:cs="Times New Roman"/>
-    </w:rPr>
-  </w:style>
-  <w:style w:type="character" w:styleId="WW8Num1z1">
+      <w:rFonts w:ascii="Times New Roman" w:eastAsia="Times New Roman" w:hAnsi="Times New Roman" w:cs="Times New Roman"/>
+    </w:rPr>
+  </w:style>
+  <w:style w:type="character" w:customStyle="1" w:styleId="WW8Num1z1">
     <w:name w:val="WW8Num1z1"/>
     <w:qFormat/>
     <w:rPr>
       <w:rFonts w:ascii="Courier New" w:hAnsi="Courier New" w:cs="Courier New"/>
     </w:rPr>
   </w:style>
-  <w:style w:type="character" w:styleId="WW8Num1z2">
+  <w:style w:type="character" w:customStyle="1" w:styleId="WW8Num1z2">
     <w:name w:val="WW8Num1z2"/>
     <w:qFormat/>
     <w:rPr>
       <w:rFonts w:ascii="Wingdings" w:hAnsi="Wingdings" w:cs="Wingdings"/>
     </w:rPr>
   </w:style>
-  <w:style w:type="character" w:styleId="WW8Num1z3">
+  <w:style w:type="character" w:customStyle="1" w:styleId="WW8Num1z3">
     <w:name w:val="WW8Num1z3"/>
     <w:qFormat/>
     <w:rPr>
       <w:rFonts w:ascii="Symbol" w:hAnsi="Symbol" w:cs="Symbol"/>
     </w:rPr>
   </w:style>
-  <w:style w:type="character" w:styleId="WW8Num2z0">
+  <w:style w:type="character" w:customStyle="1" w:styleId="WW8Num2z0">
     <w:name w:val="WW8Num2z0"/>
     <w:qFormat/>
     <w:rPr>
       <w:rFonts w:ascii="Wingdings" w:hAnsi="Wingdings" w:cs="Wingdings"/>
     </w:rPr>
   </w:style>
-  <w:style w:type="character" w:styleId="WW8Num2z1">
+  <w:style w:type="character" w:customStyle="1" w:styleId="WW8Num2z1">
     <w:name w:val="WW8Num2z1"/>
     <w:qFormat/>
     <w:rPr>
       <w:rFonts w:ascii="Courier New" w:hAnsi="Courier New" w:cs="Courier New"/>
     </w:rPr>
   </w:style>
-  <w:style w:type="character" w:styleId="WW8Num2z3">
+  <w:style w:type="character" w:customStyle="1" w:styleId="WW8Num2z3">
     <w:name w:val="WW8Num2z3"/>
     <w:qFormat/>
     <w:rPr>
       <w:rFonts w:ascii="Symbol" w:hAnsi="Symbol" w:cs="Symbol"/>
     </w:rPr>
   </w:style>
-  <w:style w:type="character" w:styleId="WW8Num3z1">
+  <w:style w:type="character" w:customStyle="1" w:styleId="WW8Num3z1">
     <w:name w:val="WW8Num3z1"/>
     <w:qFormat/>
     <w:rPr>
       <w:rFonts w:ascii="Symbol" w:hAnsi="Symbol" w:cs="Symbol"/>
     </w:rPr>
   </w:style>
-  <w:style w:type="character" w:styleId="WW8Num4z0">
+  <w:style w:type="character" w:customStyle="1" w:styleId="WW8Num4z0">
     <w:name w:val="WW8Num4z0"/>
     <w:qFormat/>
     <w:rPr>
       <w:b/>
-      <w:i w:val="false"/>
+      <w:i w:val="0"/>
       <w:color w:val="000000"/>
     </w:rPr>
   </w:style>
-  <w:style w:type="character" w:styleId="WW8Num4z1">
+  <w:style w:type="character" w:customStyle="1" w:styleId="WW8Num4z1">
     <w:name w:val="WW8Num4z1"/>
     <w:qFormat/>
     <w:rPr>
       <w:rFonts w:hint="eastAsia"/>
-      <w:b w:val="false"/>
+      <w:b w:val="0"/>
       <w:color w:val="000000"/>
     </w:rPr>
   </w:style>
-  <w:style w:type="character" w:styleId="WW8Num4z2">
+  <w:style w:type="character" w:customStyle="1" w:styleId="WW8Num4z2">
     <w:name w:val="WW8Num4z2"/>
     <w:qFormat/>
-    <w:rPr/>
-  </w:style>
-  <w:style w:type="character" w:styleId="WW8Num5z0">
+  </w:style>
+  <w:style w:type="character" w:customStyle="1" w:styleId="WW8Num5z0">
     <w:name w:val="WW8Num5z0"/>
     <w:qFormat/>
-    <w:rPr/>
-  </w:style>
-  <w:style w:type="character" w:styleId="WW8Num6z0">
+  </w:style>
+  <w:style w:type="character" w:customStyle="1" w:styleId="WW8Num6z0">
     <w:name w:val="WW8Num6z0"/>
     <w:qFormat/>
     <w:rPr>
       <w:rFonts w:ascii="Wingdings" w:hAnsi="Wingdings" w:cs="Wingdings"/>
     </w:rPr>
   </w:style>
-  <w:style w:type="character" w:styleId="WW8Num6z1">
+  <w:style w:type="character" w:customStyle="1" w:styleId="WW8Num6z1">
     <w:name w:val="WW8Num6z1"/>
     <w:qFormat/>
     <w:rPr>
       <w:rFonts w:ascii="Courier New" w:hAnsi="Courier New" w:cs="Courier New"/>
     </w:rPr>
   </w:style>
-  <w:style w:type="character" w:styleId="WW8Num6z3">
+  <w:style w:type="character" w:customStyle="1" w:styleId="WW8Num6z3">
     <w:name w:val="WW8Num6z3"/>
     <w:qFormat/>
     <w:rPr>
       <w:rFonts w:ascii="Symbol" w:hAnsi="Symbol" w:cs="Symbol"/>
     </w:rPr>
   </w:style>
-  <w:style w:type="character" w:styleId="WW8Num7z0">
+  <w:style w:type="character" w:customStyle="1" w:styleId="WW8Num7z0">
     <w:name w:val="WW8Num7z0"/>
     <w:qFormat/>
     <w:rPr>
-      <w:rFonts w:ascii=".VnTime" w:hAnsi=".VnTime" w:eastAsia="Times New Roman" w:cs="Times New Roman"/>
-    </w:rPr>
-  </w:style>
-  <w:style w:type="character" w:styleId="WW8Num7z1">
+      <w:rFonts w:ascii=".VnTime" w:eastAsia="Times New Roman" w:hAnsi=".VnTime" w:cs="Times New Roman"/>
+    </w:rPr>
+  </w:style>
+  <w:style w:type="character" w:customStyle="1" w:styleId="WW8Num7z1">
     <w:name w:val="WW8Num7z1"/>
     <w:qFormat/>
     <w:rPr>
       <w:rFonts w:ascii="Courier New" w:hAnsi="Courier New" w:cs="Courier New"/>
     </w:rPr>
   </w:style>
-  <w:style w:type="character" w:styleId="WW8Num7z2">
+  <w:style w:type="character" w:customStyle="1" w:styleId="WW8Num7z2">
     <w:name w:val="WW8Num7z2"/>
     <w:qFormat/>
     <w:rPr>
       <w:rFonts w:ascii="Wingdings" w:hAnsi="Wingdings" w:cs="Wingdings"/>
     </w:rPr>
   </w:style>
-  <w:style w:type="character" w:styleId="WW8Num7z3">
+  <w:style w:type="character" w:customStyle="1" w:styleId="WW8Num7z3">
     <w:name w:val="WW8Num7z3"/>
     <w:qFormat/>
     <w:rPr>
       <w:rFonts w:ascii="Symbol" w:hAnsi="Symbol" w:cs="Symbol"/>
     </w:rPr>
   </w:style>
-  <w:style w:type="character" w:styleId="WW8Num8z0">
+  <w:style w:type="character" w:customStyle="1" w:styleId="WW8Num8z0">
     <w:name w:val="WW8Num8z0"/>
     <w:qFormat/>
     <w:rPr>
       <w:rFonts w:ascii="Symbol" w:hAnsi="Symbol" w:cs="Symbol"/>
     </w:rPr>
   </w:style>
-  <w:style w:type="character" w:styleId="WW8Num8z1">
+  <w:style w:type="character" w:customStyle="1" w:styleId="WW8Num8z1">
     <w:name w:val="WW8Num8z1"/>
     <w:qFormat/>
     <w:rPr>
       <w:rFonts w:ascii="Courier New" w:hAnsi="Courier New" w:cs="Courier New"/>
     </w:rPr>
   </w:style>
-  <w:style w:type="character" w:styleId="WW8Num8z5">
+  <w:style w:type="character" w:customStyle="1" w:styleId="WW8Num8z5">
     <w:name w:val="WW8Num8z5"/>
     <w:qFormat/>
     <w:rPr>
       <w:rFonts w:ascii="Wingdings" w:hAnsi="Wingdings" w:cs="Wingdings"/>
     </w:rPr>
   </w:style>
-  <w:style w:type="character" w:styleId="WW8Num9z0">
+  <w:style w:type="character" w:customStyle="1" w:styleId="WW8Num9z0">
     <w:name w:val="WW8Num9z0"/>
     <w:qFormat/>
     <w:rPr>
@@ -2438,99 +2668,94 @@
       <w:color w:val="000000"/>
     </w:rPr>
   </w:style>
-  <w:style w:type="character" w:styleId="WW8Num10z0">
+  <w:style w:type="character" w:customStyle="1" w:styleId="WW8Num10z0">
     <w:name w:val="WW8Num10z0"/>
     <w:qFormat/>
-    <w:rPr/>
-  </w:style>
-  <w:style w:type="character" w:styleId="WW8Num11z0">
+  </w:style>
+  <w:style w:type="character" w:customStyle="1" w:styleId="WW8Num11z0">
     <w:name w:val="WW8Num11z0"/>
     <w:qFormat/>
     <w:rPr>
       <w:rFonts w:ascii="Wingdings" w:hAnsi="Wingdings" w:cs="Wingdings"/>
     </w:rPr>
   </w:style>
-  <w:style w:type="character" w:styleId="WW8Num11z1">
+  <w:style w:type="character" w:customStyle="1" w:styleId="WW8Num11z1">
     <w:name w:val="WW8Num11z1"/>
     <w:qFormat/>
     <w:rPr>
       <w:rFonts w:ascii="Courier New" w:hAnsi="Courier New" w:cs="Courier New"/>
     </w:rPr>
   </w:style>
-  <w:style w:type="character" w:styleId="WW8Num11z3">
+  <w:style w:type="character" w:customStyle="1" w:styleId="WW8Num11z3">
     <w:name w:val="WW8Num11z3"/>
     <w:qFormat/>
     <w:rPr>
       <w:rFonts w:ascii="Symbol" w:hAnsi="Symbol" w:cs="Symbol"/>
     </w:rPr>
   </w:style>
-  <w:style w:type="character" w:styleId="WW8Num12z0">
+  <w:style w:type="character" w:customStyle="1" w:styleId="WW8Num12z0">
     <w:name w:val="WW8Num12z0"/>
     <w:qFormat/>
     <w:rPr>
       <w:rFonts w:ascii="Wingdings" w:hAnsi="Wingdings" w:cs="Wingdings"/>
     </w:rPr>
   </w:style>
-  <w:style w:type="character" w:styleId="WW8Num12z1">
+  <w:style w:type="character" w:customStyle="1" w:styleId="WW8Num12z1">
     <w:name w:val="WW8Num12z1"/>
     <w:qFormat/>
     <w:rPr>
       <w:rFonts w:ascii="Courier New" w:hAnsi="Courier New" w:cs="Courier New"/>
     </w:rPr>
   </w:style>
-  <w:style w:type="character" w:styleId="WW8Num12z3">
+  <w:style w:type="character" w:customStyle="1" w:styleId="WW8Num12z3">
     <w:name w:val="WW8Num12z3"/>
     <w:qFormat/>
     <w:rPr>
       <w:rFonts w:ascii="Symbol" w:hAnsi="Symbol" w:cs="Symbol"/>
     </w:rPr>
   </w:style>
-  <w:style w:type="character" w:styleId="WW8Num13z0">
+  <w:style w:type="character" w:customStyle="1" w:styleId="WW8Num13z0">
     <w:name w:val="WW8Num13z0"/>
     <w:qFormat/>
-    <w:rPr/>
-  </w:style>
-  <w:style w:type="character" w:styleId="WW8Num14z0">
+  </w:style>
+  <w:style w:type="character" w:customStyle="1" w:styleId="WW8Num14z0">
     <w:name w:val="WW8Num14z0"/>
     <w:qFormat/>
-    <w:rPr/>
-  </w:style>
-  <w:style w:type="character" w:styleId="WW8Num15z0">
+  </w:style>
+  <w:style w:type="character" w:customStyle="1" w:styleId="WW8Num15z0">
     <w:name w:val="WW8Num15z0"/>
     <w:qFormat/>
     <w:rPr>
       <w:b/>
-      <w:i w:val="false"/>
+      <w:i w:val="0"/>
       <w:color w:val="000000"/>
     </w:rPr>
   </w:style>
-  <w:style w:type="character" w:styleId="WW8Num15z1">
+  <w:style w:type="character" w:customStyle="1" w:styleId="WW8Num15z1">
     <w:name w:val="WW8Num15z1"/>
     <w:qFormat/>
     <w:rPr>
       <w:rFonts w:hint="eastAsia"/>
-      <w:b w:val="false"/>
+      <w:b w:val="0"/>
       <w:color w:val="000000"/>
     </w:rPr>
   </w:style>
-  <w:style w:type="character" w:styleId="WW8Num15z2">
+  <w:style w:type="character" w:customStyle="1" w:styleId="WW8Num15z2">
     <w:name w:val="WW8Num15z2"/>
     <w:qFormat/>
     <w:rPr>
-      <w:rFonts w:ascii="Times New Roman" w:hAnsi="Times New Roman" w:eastAsia="Times New Roman" w:cs="Times New Roman"/>
+      <w:rFonts w:ascii="Times New Roman" w:eastAsia="Times New Roman" w:hAnsi="Times New Roman" w:cs="Times New Roman"/>
       <w:b/>
       <w:color w:val="000000"/>
     </w:rPr>
   </w:style>
-  <w:style w:type="character" w:styleId="Phngmcinhcuaoanvn">
+  <w:style w:type="character" w:customStyle="1" w:styleId="Phngmcinhcuaoanvn">
     <w:name w:val="Phông mặc định của đoạn văn"/>
     <w:qFormat/>
-    <w:rPr/>
   </w:style>
   <w:style w:type="character" w:styleId="PageNumber">
     <w:name w:val="page number"/>
     <w:basedOn w:val="Phngmcinhcuaoanvn"/>
-    <w:rPr/>
   </w:style>
   <w:style w:type="character" w:styleId="Hyperlink">
     <w:name w:val="Hyperlink"/>
@@ -2539,7 +2764,7 @@
       <w:u w:val="single"/>
     </w:rPr>
   </w:style>
-  <w:style w:type="character" w:styleId="KhngDncchChar">
+  <w:style w:type="character" w:customStyle="1" w:styleId="KhngDncchChar">
     <w:name w:val="Không Dãn cách Char"/>
     <w:qFormat/>
     <w:rPr>
@@ -2557,11 +2782,11 @@
       <w:iCs/>
     </w:rPr>
   </w:style>
-  <w:style w:type="character" w:styleId="u1Char">
+  <w:style w:type="character" w:customStyle="1" w:styleId="u1Char">
     <w:name w:val="Đầu đề 1 Char"/>
     <w:qFormat/>
     <w:rPr>
-      <w:rFonts w:ascii="Calibri Light" w:hAnsi="Calibri Light" w:eastAsia="Times New Roman" w:cs="Times New Roman"/>
+      <w:rFonts w:ascii="Calibri Light" w:eastAsia="Times New Roman" w:hAnsi="Calibri Light" w:cs="Times New Roman"/>
       <w:b/>
       <w:bCs/>
       <w:kern w:val="2"/>
@@ -2569,7 +2794,7 @@
       <w:szCs w:val="32"/>
     </w:rPr>
   </w:style>
-  <w:style w:type="character" w:styleId="Thnvnban3Char">
+  <w:style w:type="character" w:customStyle="1" w:styleId="Thnvnban3Char">
     <w:name w:val="Thân văn bản 3 Char"/>
     <w:qFormat/>
     <w:rPr>
@@ -2577,7 +2802,7 @@
       <w:szCs w:val="16"/>
     </w:rPr>
   </w:style>
-  <w:style w:type="character" w:styleId="Thnvnban2Char">
+  <w:style w:type="character" w:customStyle="1" w:styleId="Thnvnban2Char">
     <w:name w:val="Thân văn bản 2 Char"/>
     <w:qFormat/>
     <w:rPr>
@@ -2586,7 +2811,7 @@
       <w:szCs w:val="24"/>
     </w:rPr>
   </w:style>
-  <w:style w:type="character" w:styleId="ChntrangChar">
+  <w:style w:type="character" w:customStyle="1" w:styleId="ChntrangChar">
     <w:name w:val="Chân trang Char"/>
     <w:qFormat/>
     <w:rPr>
@@ -2594,17 +2819,17 @@
       <w:szCs w:val="24"/>
     </w:rPr>
   </w:style>
-  <w:style w:type="paragraph" w:styleId="Heading">
+  <w:style w:type="paragraph" w:customStyle="1" w:styleId="Heading">
     <w:name w:val="Heading"/>
     <w:basedOn w:val="Normal"/>
     <w:next w:val="BodyText"/>
     <w:qFormat/>
     <w:pPr>
-      <w:keepNext w:val="true"/>
+      <w:keepNext/>
       <w:spacing w:before="240" w:after="120"/>
     </w:pPr>
     <w:rPr>
-      <w:rFonts w:ascii="Liberation Sans" w:hAnsi="Liberation Sans" w:eastAsia="Microsoft YaHei" w:cs="Lucida Sans"/>
+      <w:rFonts w:ascii="Liberation Sans" w:eastAsia="Microsoft YaHei" w:hAnsi="Liberation Sans" w:cs="Lucida Sans"/>
       <w:sz w:val="28"/>
       <w:szCs w:val="28"/>
     </w:rPr>
@@ -2613,14 +2838,12 @@
     <w:name w:val="Body Text"/>
     <w:basedOn w:val="Normal"/>
     <w:pPr>
-      <w:spacing w:lineRule="auto" w:line="276" w:before="0" w:after="140"/>
+      <w:spacing w:after="140" w:line="276" w:lineRule="auto"/>
     </w:pPr>
-    <w:rPr/>
   </w:style>
   <w:style w:type="paragraph" w:styleId="List">
     <w:name w:val="List"/>
     <w:basedOn w:val="BodyText"/>
-    <w:pPr/>
     <w:rPr>
       <w:rFonts w:cs="Lucida Sans"/>
     </w:rPr>
@@ -2637,11 +2860,9 @@
       <w:rFonts w:cs="Lucida Sans"/>
       <w:i/>
       <w:iCs/>
-      <w:sz w:val="24"/>
-      <w:szCs w:val="24"/>
-    </w:rPr>
-  </w:style>
-  <w:style w:type="paragraph" w:styleId="Index">
+    </w:rPr>
+  </w:style>
+  <w:style w:type="paragraph" w:customStyle="1" w:styleId="Index">
     <w:name w:val="Index"/>
     <w:basedOn w:val="Normal"/>
     <w:qFormat/>
@@ -2652,37 +2873,32 @@
       <w:rFonts w:cs="Lucida Sans"/>
     </w:rPr>
   </w:style>
-  <w:style w:type="paragraph" w:styleId="HeaderandFooter">
+  <w:style w:type="paragraph" w:customStyle="1" w:styleId="HeaderandFooter">
     <w:name w:val="Header and Footer"/>
     <w:basedOn w:val="Normal"/>
     <w:qFormat/>
     <w:pPr>
       <w:suppressLineNumbers/>
       <w:tabs>
-        <w:tab w:val="clear" w:pos="720"/>
-        <w:tab w:val="center" w:pos="4986" w:leader="none"/>
-        <w:tab w:val="right" w:pos="9972" w:leader="none"/>
+        <w:tab w:val="center" w:pos="4986"/>
+        <w:tab w:val="right" w:pos="9972"/>
       </w:tabs>
     </w:pPr>
-    <w:rPr/>
   </w:style>
   <w:style w:type="paragraph" w:styleId="Footer">
     <w:name w:val="footer"/>
     <w:basedOn w:val="Normal"/>
     <w:pPr>
       <w:tabs>
-        <w:tab w:val="clear" w:pos="720"/>
-        <w:tab w:val="center" w:pos="4320" w:leader="none"/>
-        <w:tab w:val="right" w:pos="8640" w:leader="none"/>
+        <w:tab w:val="center" w:pos="4320"/>
+        <w:tab w:val="right" w:pos="8640"/>
       </w:tabs>
     </w:pPr>
-    <w:rPr/>
-  </w:style>
-  <w:style w:type="paragraph" w:styleId="Bongchuthich">
+  </w:style>
+  <w:style w:type="paragraph" w:customStyle="1" w:styleId="Bongchuthich">
     <w:name w:val="Bóng chú thích"/>
     <w:basedOn w:val="Normal"/>
     <w:qFormat/>
-    <w:pPr/>
     <w:rPr>
       <w:rFonts w:ascii="Tahoma" w:hAnsi="Tahoma" w:cs="Tahoma"/>
       <w:sz w:val="16"/>
@@ -2694,25 +2910,21 @@
     <w:basedOn w:val="Normal"/>
     <w:pPr>
       <w:tabs>
-        <w:tab w:val="clear" w:pos="720"/>
-        <w:tab w:val="center" w:pos="4320" w:leader="none"/>
-        <w:tab w:val="right" w:pos="8640" w:leader="none"/>
+        <w:tab w:val="center" w:pos="4320"/>
+        <w:tab w:val="right" w:pos="8640"/>
       </w:tabs>
     </w:pPr>
-    <w:rPr/>
-  </w:style>
-  <w:style w:type="paragraph" w:styleId="oancuaDanhsach">
+  </w:style>
+  <w:style w:type="paragraph" w:customStyle="1" w:styleId="oancuaDanhsach">
     <w:name w:val="Đoạn của Danh sách"/>
     <w:basedOn w:val="Normal"/>
     <w:qFormat/>
     <w:pPr>
-      <w:spacing w:before="0" w:after="0"/>
-      <w:ind w:hanging="0" w:start="720" w:end="0"/>
+      <w:ind w:left="720"/>
       <w:contextualSpacing/>
     </w:pPr>
-    <w:rPr/>
-  </w:style>
-  <w:style w:type="paragraph" w:styleId="Thnvnban2">
+  </w:style>
+  <w:style w:type="paragraph" w:customStyle="1" w:styleId="Thnvnban2">
     <w:name w:val="Thân văn bản 2"/>
     <w:basedOn w:val="Normal"/>
     <w:qFormat/>
@@ -2724,13 +2936,13 @@
       <w:sz w:val="26"/>
     </w:rPr>
   </w:style>
-  <w:style w:type="paragraph" w:styleId="Char">
+  <w:style w:type="paragraph" w:customStyle="1" w:styleId="Char">
     <w:name w:val="Char"/>
     <w:basedOn w:val="Normal"/>
     <w:qFormat/>
     <w:pPr>
       <w:spacing w:before="280" w:after="280"/>
-      <w:ind w:hanging="0" w:start="851" w:end="0"/>
+      <w:ind w:left="851"/>
     </w:pPr>
     <w:rPr>
       <w:rFonts w:ascii="Tahoma" w:hAnsi="Tahoma" w:cs="Tahoma"/>
@@ -2738,49 +2950,45 @@
       <w:szCs w:val="26"/>
     </w:rPr>
   </w:style>
-  <w:style w:type="paragraph" w:styleId="KhngDncch">
+  <w:style w:type="paragraph" w:customStyle="1" w:styleId="KhngDncch">
     <w:name w:val="Không Dãn cách"/>
     <w:qFormat/>
     <w:pPr>
-      <w:widowControl/>
-      <w:bidi w:val="0"/>
+      <w:suppressAutoHyphens/>
     </w:pPr>
     <w:rPr>
-      <w:rFonts w:ascii="Calibri" w:hAnsi="Calibri" w:eastAsia="Times New Roman" w:cs="Calibri"/>
-      <w:color w:val="auto"/>
+      <w:rFonts w:ascii="Calibri" w:eastAsia="Times New Roman" w:hAnsi="Calibri" w:cs="Calibri"/>
       <w:sz w:val="22"/>
       <w:szCs w:val="22"/>
-      <w:lang w:bidi="ar-SA" w:val="en-US" w:eastAsia="zh-CN"/>
-    </w:rPr>
-  </w:style>
-  <w:style w:type="paragraph" w:styleId="Thnvnban3">
+      <w:lang w:val="en-US" w:eastAsia="zh-CN"/>
+    </w:rPr>
+  </w:style>
+  <w:style w:type="paragraph" w:customStyle="1" w:styleId="Thnvnban3">
     <w:name w:val="Thân văn bản 3"/>
     <w:basedOn w:val="Normal"/>
     <w:qFormat/>
     <w:pPr>
-      <w:spacing w:before="0" w:after="120"/>
+      <w:spacing w:after="120"/>
     </w:pPr>
     <w:rPr>
       <w:sz w:val="16"/>
       <w:szCs w:val="16"/>
     </w:rPr>
   </w:style>
-  <w:style w:type="paragraph" w:styleId="TableContents">
+  <w:style w:type="paragraph" w:customStyle="1" w:styleId="TableContents">
     <w:name w:val="Table Contents"/>
     <w:basedOn w:val="Normal"/>
     <w:qFormat/>
     <w:pPr>
-      <w:widowControl w:val="false"/>
+      <w:widowControl w:val="0"/>
       <w:suppressLineNumbers/>
     </w:pPr>
-    <w:rPr/>
-  </w:style>
-  <w:style w:type="paragraph" w:styleId="TableHeading">
+  </w:style>
+  <w:style w:type="paragraph" w:customStyle="1" w:styleId="TableHeading">
     <w:name w:val="Table Heading"/>
     <w:basedOn w:val="TableContents"/>
     <w:qFormat/>
     <w:pPr>
-      <w:suppressLineNumbers/>
       <w:jc w:val="center"/>
     </w:pPr>
     <w:rPr>
@@ -2788,63 +2996,63 @@
       <w:bCs/>
     </w:rPr>
   </w:style>
-  <w:style w:type="numbering" w:styleId="WW8Num1">
+  <w:style w:type="numbering" w:customStyle="1" w:styleId="WW8Num1">
     <w:name w:val="WW8Num1"/>
     <w:qFormat/>
   </w:style>
-  <w:style w:type="numbering" w:styleId="WW8Num2">
+  <w:style w:type="numbering" w:customStyle="1" w:styleId="WW8Num2">
     <w:name w:val="WW8Num2"/>
     <w:qFormat/>
   </w:style>
-  <w:style w:type="numbering" w:styleId="WW8Num3">
+  <w:style w:type="numbering" w:customStyle="1" w:styleId="WW8Num3">
     <w:name w:val="WW8Num3"/>
     <w:qFormat/>
   </w:style>
-  <w:style w:type="numbering" w:styleId="WW8Num4">
+  <w:style w:type="numbering" w:customStyle="1" w:styleId="WW8Num4">
     <w:name w:val="WW8Num4"/>
     <w:qFormat/>
   </w:style>
-  <w:style w:type="numbering" w:styleId="WW8Num5">
+  <w:style w:type="numbering" w:customStyle="1" w:styleId="WW8Num5">
     <w:name w:val="WW8Num5"/>
     <w:qFormat/>
   </w:style>
-  <w:style w:type="numbering" w:styleId="WW8Num6">
+  <w:style w:type="numbering" w:customStyle="1" w:styleId="WW8Num6">
     <w:name w:val="WW8Num6"/>
     <w:qFormat/>
   </w:style>
-  <w:style w:type="numbering" w:styleId="WW8Num7">
+  <w:style w:type="numbering" w:customStyle="1" w:styleId="WW8Num7">
     <w:name w:val="WW8Num7"/>
     <w:qFormat/>
   </w:style>
-  <w:style w:type="numbering" w:styleId="WW8Num8">
+  <w:style w:type="numbering" w:customStyle="1" w:styleId="WW8Num8">
     <w:name w:val="WW8Num8"/>
     <w:qFormat/>
   </w:style>
-  <w:style w:type="numbering" w:styleId="WW8Num9">
+  <w:style w:type="numbering" w:customStyle="1" w:styleId="WW8Num9">
     <w:name w:val="WW8Num9"/>
     <w:qFormat/>
   </w:style>
-  <w:style w:type="numbering" w:styleId="WW8Num10">
+  <w:style w:type="numbering" w:customStyle="1" w:styleId="WW8Num10">
     <w:name w:val="WW8Num10"/>
     <w:qFormat/>
   </w:style>
-  <w:style w:type="numbering" w:styleId="WW8Num11">
+  <w:style w:type="numbering" w:customStyle="1" w:styleId="WW8Num11">
     <w:name w:val="WW8Num11"/>
     <w:qFormat/>
   </w:style>
-  <w:style w:type="numbering" w:styleId="WW8Num12">
+  <w:style w:type="numbering" w:customStyle="1" w:styleId="WW8Num12">
     <w:name w:val="WW8Num12"/>
     <w:qFormat/>
   </w:style>
-  <w:style w:type="numbering" w:styleId="WW8Num13">
+  <w:style w:type="numbering" w:customStyle="1" w:styleId="WW8Num13">
     <w:name w:val="WW8Num13"/>
     <w:qFormat/>
   </w:style>
-  <w:style w:type="numbering" w:styleId="WW8Num14">
+  <w:style w:type="numbering" w:customStyle="1" w:styleId="WW8Num14">
     <w:name w:val="WW8Num14"/>
     <w:qFormat/>
   </w:style>
-  <w:style w:type="numbering" w:styleId="WW8Num15">
+  <w:style w:type="numbering" w:customStyle="1" w:styleId="WW8Num15">
     <w:name w:val="WW8Num15"/>
     <w:qFormat/>
   </w:style>
@@ -2852,7 +3060,7 @@
 </file>
 
 <file path=word/theme/theme1.xml><?xml version="1.0" encoding="utf-8"?>
-<a:theme xmlns:a="http://schemas.openxmlformats.org/drawingml/2006/main" xmlns:r="http://schemas.openxmlformats.org/officeDocument/2006/relationships" name="Office">
+<a:theme xmlns:a="http://schemas.openxmlformats.org/drawingml/2006/main" name="Office">
   <a:themeElements>
     <a:clrScheme name="LibreOffice">
       <a:dk1>
@@ -2894,14 +3102,14 @@
     </a:clrScheme>
     <a:fontScheme name="Office">
       <a:majorFont>
-        <a:latin typeface="Arial" pitchFamily="0" charset="1"/>
-        <a:ea typeface="DejaVu Sans" pitchFamily="0" charset="1"/>
-        <a:cs typeface="DejaVu Sans" pitchFamily="0" charset="1"/>
+        <a:latin typeface="Arial"/>
+        <a:ea typeface="DejaVu Sans"/>
+        <a:cs typeface="DejaVu Sans"/>
       </a:majorFont>
       <a:minorFont>
-        <a:latin typeface="Arial" pitchFamily="0" charset="1"/>
-        <a:ea typeface="DejaVu Sans" pitchFamily="0" charset="1"/>
-        <a:cs typeface="DejaVu Sans" pitchFamily="0" charset="1"/>
+        <a:latin typeface="Arial"/>
+        <a:ea typeface="DejaVu Sans"/>
+        <a:cs typeface="DejaVu Sans"/>
       </a:minorFont>
     </a:fontScheme>
     <a:fmtScheme>
@@ -2954,5 +3162,7 @@
       </a:bgFillStyleLst>
     </a:fmtScheme>
   </a:themeElements>
+  <a:objectDefaults/>
+  <a:extraClrSchemeLst/>
 </a:theme>
 </file>
</xml_diff>